<commit_message>
feat(v3): add Light/Dark mode toggle, fix map container overlap, and upgrade ML to Leak-Free Smart-Pearson + Spatial IDW (RMSE 0.4984)
</commit_message>
<xml_diff>
--- a/Documento_Tecnico_Agrotec_Amanteca_FIRA2026.docx
+++ b/Documento_Tecnico_Agrotec_Amanteca_FIRA2026.docx
@@ -78,7 +78,7 @@
         </w:rPr>
         <w:t>Equipo: Agrotec-Amanteca  |  197 Parcelas Analizadas (138 Entrenamiento · 59 Predicción Ciega)</w:t>
         <w:br/>
-        <w:t>Modelo Ganador: Ensemble Agrotec-Amanteca (Voting) (MAE CV: 0.3662 t/ha · RMSE CV: 0.5062 t/ha · R²: 0.5981)</w:t>
+        <w:t>Modelo Ganador: Ensemble Agrotec V3 (Smart-Pearson + IDW) (MAE CV: 0.3576 t/ha · RMSE CV: 0.4984 t/ha · R²: 0.6098)</w:t>
       </w:r>
     </w:p>
     <w:tbl>
@@ -194,7 +194,7 @@
           </w:tcPr>
           <w:p>
             <w:r>
-              <w:t>Reducción de 175 a 39 variables vía filtro de Pearson (|r| &lt; 0.90), 0% valores nulos</w:t>
+              <w:t>Reducción de 175 a 27 variables vía filtro de Pearson (|r| &lt; 0.90), 0% valores nulos</w:t>
             </w:r>
           </w:p>
         </w:tc>
@@ -221,7 +221,7 @@
           </w:tcPr>
           <w:p>
             <w:r>
-              <w:t>MAE = 0.3662 t/ha | RMSE = 0.5062 t/ha | R² = 0.5981 | MAPE OOF = 10.46%</w:t>
+              <w:t>MAE = 0.3576 t/ha | RMSE = 0.4984 t/ha | R² = 0.6098 | MAPE OOF = 10.18%</w:t>
             </w:r>
           </w:p>
         </w:tc>
@@ -248,7 +248,7 @@
           </w:tcPr>
           <w:p>
             <w:r>
-              <w:t>Inferencia de 197 parcelas en 159.77 ms | Backend en Railway + Dashboard Responsive en Vercel/Cloudflare</w:t>
+              <w:t>Inferencia de 197 parcelas en 88.06 ms | Backend en Railway + Dashboard Responsive en Vercel/Cloudflare</w:t>
             </w:r>
           </w:p>
         </w:tc>
@@ -344,7 +344,7 @@
         <w:t xml:space="preserve">Control de Multicolinealidad mediante Filtro de Correlación de Pearson (|r| &lt; 0.90): </w:t>
       </w:r>
       <w:r>
-        <w:t>La matriz inicial contenía 175 variables brutas. Con N = 138 parcelas de entrenamiento, mantener 175 columnas colineales induce sobreajuste severo (p &gt; N). El filtro de Pearson eliminó el 77.7% de variables redundantes, preservando 39 predictores numéricos ortogonales con 100% de completitud (0 valores nulos) y una correlación media entre pares de apenas 0.3221.</w:t>
+        <w:t>La matriz inicial contenía 175 variables brutas. Con N = 138 parcelas de entrenamiento, mantener 175 columnas colineales induce sobreajuste severo (p &gt; N). El filtro de Pearson eliminó el 84.0% de variables redundantes, preservando 27 predictores numéricos ortogonales con 100% de completitud (0 valores nulos) y una correlación media entre pares de apenas 0.3722.</w:t>
       </w:r>
     </w:p>
     <w:p>
@@ -532,7 +532,7 @@
                 <w:b/>
                 <w:sz w:val="18"/>
               </w:rPr>
-              <w:t>Ensemble Agrotec-Amanteca (Voting)</w:t>
+              <w:t>Ensemble Agrotec V3 (Smart-Pearson + IDW)</w:t>
             </w:r>
           </w:p>
         </w:tc>
@@ -547,7 +547,7 @@
                 <w:b/>
                 <w:sz w:val="18"/>
               </w:rPr>
-              <w:t>39 base</w:t>
+              <w:t>23 Smart-Pearson+IDW</w:t>
             </w:r>
           </w:p>
         </w:tc>
@@ -562,7 +562,7 @@
                 <w:b/>
                 <w:sz w:val="18"/>
               </w:rPr>
-              <w:t>0.3662 ± 0.063</w:t>
+              <w:t>0.3576 ± 0.066</w:t>
             </w:r>
           </w:p>
         </w:tc>
@@ -577,7 +577,7 @@
                 <w:b/>
                 <w:sz w:val="18"/>
               </w:rPr>
-              <w:t>0.5062 ± 0.096</w:t>
+              <w:t>0.4984 ± 0.108</w:t>
             </w:r>
           </w:p>
         </w:tc>
@@ -592,7 +592,7 @@
                 <w:b/>
                 <w:sz w:val="18"/>
               </w:rPr>
-              <w:t>0.5981</w:t>
+              <w:t>0.6098</w:t>
             </w:r>
           </w:p>
         </w:tc>
@@ -607,7 +607,7 @@
                 <w:b/>
                 <w:sz w:val="18"/>
               </w:rPr>
-              <w:t>7244 ms</w:t>
+              <w:t>2933 ms</w:t>
             </w:r>
           </w:p>
         </w:tc>
@@ -623,7 +623,7 @@
               <w:rPr>
                 <w:sz w:val="18"/>
               </w:rPr>
-              <w:t>Ensemble + Variables Fenológicas (44)</w:t>
+              <w:t>Stacking Meta-Ensemble V3 (Smart-Pearson)</w:t>
             </w:r>
           </w:p>
         </w:tc>
@@ -637,7 +637,7 @@
               <w:rPr>
                 <w:sz w:val="18"/>
               </w:rPr>
-              <w:t>44 eng</w:t>
+              <w:t>23 Smart-Pearson+IDW</w:t>
             </w:r>
           </w:p>
         </w:tc>
@@ -651,7 +651,7 @@
               <w:rPr>
                 <w:sz w:val="18"/>
               </w:rPr>
-              <w:t>0.3685 ± 0.059</w:t>
+              <w:t>0.3606 ± 0.066</w:t>
             </w:r>
           </w:p>
         </w:tc>
@@ -665,7 +665,7 @@
               <w:rPr>
                 <w:sz w:val="18"/>
               </w:rPr>
-              <w:t>0.5073 ± 0.095</w:t>
+              <w:t>0.5006 ± 0.107</w:t>
             </w:r>
           </w:p>
         </w:tc>
@@ -679,7 +679,7 @@
               <w:rPr>
                 <w:sz w:val="18"/>
               </w:rPr>
-              <w:t>0.5960</w:t>
+              <w:t>0.6095</w:t>
             </w:r>
           </w:p>
         </w:tc>
@@ -693,7 +693,7 @@
               <w:rPr>
                 <w:sz w:val="18"/>
               </w:rPr>
-              <w:t>4723 ms</w:t>
+              <w:t>16325 ms</w:t>
             </w:r>
           </w:p>
         </w:tc>
@@ -709,7 +709,7 @@
               <w:rPr>
                 <w:sz w:val="18"/>
               </w:rPr>
-              <w:t>Stacking Meta-Ensemble (RidgeCV)</w:t>
+              <w:t>Ensemble Agrotec V2 (Filtro Secuencial 39)</w:t>
             </w:r>
           </w:p>
         </w:tc>
@@ -737,7 +737,7 @@
               <w:rPr>
                 <w:sz w:val="18"/>
               </w:rPr>
-              <w:t>0.3749 ± 0.066</w:t>
+              <w:t>0.3661 ± 0.063</w:t>
             </w:r>
           </w:p>
         </w:tc>
@@ -751,7 +751,7 @@
               <w:rPr>
                 <w:sz w:val="18"/>
               </w:rPr>
-              <w:t>0.5133 ± 0.096</w:t>
+              <w:t>0.5058 ± 0.097</w:t>
             </w:r>
           </w:p>
         </w:tc>
@@ -765,7 +765,7 @@
               <w:rPr>
                 <w:sz w:val="18"/>
               </w:rPr>
-              <w:t>0.5904</w:t>
+              <w:t>0.5999</w:t>
             </w:r>
           </w:p>
         </w:tc>
@@ -779,7 +779,7 @@
               <w:rPr>
                 <w:sz w:val="18"/>
               </w:rPr>
-              <w:t>23272 ms</w:t>
+              <w:t>2730 ms</w:t>
             </w:r>
           </w:p>
         </w:tc>
@@ -795,7 +795,7 @@
               <w:rPr>
                 <w:sz w:val="18"/>
               </w:rPr>
-              <w:t>Random Forest (Baseline)</w:t>
+              <w:t>Extra Trees V3 (Smart-Pearson + IDW)</w:t>
             </w:r>
           </w:p>
         </w:tc>
@@ -809,7 +809,7 @@
               <w:rPr>
                 <w:sz w:val="18"/>
               </w:rPr>
-              <w:t>39 base</w:t>
+              <w:t>23 Smart-Pearson+IDW</w:t>
             </w:r>
           </w:p>
         </w:tc>
@@ -823,7 +823,7 @@
               <w:rPr>
                 <w:sz w:val="18"/>
               </w:rPr>
-              <w:t>0.3742 ± 0.059</w:t>
+              <w:t>0.3682 ± 0.061</w:t>
             </w:r>
           </w:p>
         </w:tc>
@@ -837,7 +837,7 @@
               <w:rPr>
                 <w:sz w:val="18"/>
               </w:rPr>
-              <w:t>0.5139 ± 0.092</w:t>
+              <w:t>0.5077 ± 0.095</w:t>
             </w:r>
           </w:p>
         </w:tc>
@@ -851,7 +851,7 @@
               <w:rPr>
                 <w:sz w:val="18"/>
               </w:rPr>
-              <w:t>0.5859</w:t>
+              <w:t>0.5947</w:t>
             </w:r>
           </w:p>
         </w:tc>
@@ -865,7 +865,7 @@
               <w:rPr>
                 <w:sz w:val="18"/>
               </w:rPr>
-              <w:t>1681 ms</w:t>
+              <w:t>1238 ms</w:t>
             </w:r>
           </w:p>
         </w:tc>
@@ -881,7 +881,7 @@
               <w:rPr>
                 <w:sz w:val="18"/>
               </w:rPr>
-              <w:t>Extra Trees Regressor</w:t>
+              <w:t>Gradient Boosting Regressor</w:t>
             </w:r>
           </w:p>
         </w:tc>
@@ -909,7 +909,7 @@
               <w:rPr>
                 <w:sz w:val="18"/>
               </w:rPr>
-              <w:t>0.3741 ± 0.059</w:t>
+              <w:t>0.3841 ± 0.062</w:t>
             </w:r>
           </w:p>
         </w:tc>
@@ -923,7 +923,7 @@
               <w:rPr>
                 <w:sz w:val="18"/>
               </w:rPr>
-              <w:t>0.5156 ± 0.086</w:t>
+              <w:t>0.5095 ± 0.092</w:t>
             </w:r>
           </w:p>
         </w:tc>
@@ -937,7 +937,7 @@
               <w:rPr>
                 <w:sz w:val="18"/>
               </w:rPr>
-              <w:t>0.5826</w:t>
+              <w:t>0.5952</w:t>
             </w:r>
           </w:p>
         </w:tc>
@@ -951,7 +951,7 @@
               <w:rPr>
                 <w:sz w:val="18"/>
               </w:rPr>
-              <w:t>2506 ms</w:t>
+              <w:t>354 ms</w:t>
             </w:r>
           </w:p>
         </w:tc>
@@ -967,7 +967,7 @@
               <w:rPr>
                 <w:sz w:val="18"/>
               </w:rPr>
-              <w:t>RidgeCV Lineal Regularizado</w:t>
+              <w:t>Extra Trees Regressor (39 base)</w:t>
             </w:r>
           </w:p>
         </w:tc>
@@ -995,7 +995,7 @@
               <w:rPr>
                 <w:sz w:val="18"/>
               </w:rPr>
-              <w:t>0.3819 ± 0.061</w:t>
+              <w:t>0.3731 ± 0.064</w:t>
             </w:r>
           </w:p>
         </w:tc>
@@ -1009,7 +1009,7 @@
               <w:rPr>
                 <w:sz w:val="18"/>
               </w:rPr>
-              <w:t>0.5180 ± 0.085</w:t>
+              <w:t>0.5134 ± 0.096</w:t>
             </w:r>
           </w:p>
         </w:tc>
@@ -1023,7 +1023,7 @@
               <w:rPr>
                 <w:sz w:val="18"/>
               </w:rPr>
-              <w:t>0.5802</w:t>
+              <w:t>0.5857</w:t>
             </w:r>
           </w:p>
         </w:tc>
@@ -1037,7 +1037,7 @@
               <w:rPr>
                 <w:sz w:val="18"/>
               </w:rPr>
-              <w:t>68 ms</w:t>
+              <w:t>1052 ms</w:t>
             </w:r>
           </w:p>
         </w:tc>
@@ -1053,7 +1053,7 @@
               <w:rPr>
                 <w:sz w:val="18"/>
               </w:rPr>
-              <w:t>Gradient Boosting Regressor</w:t>
+              <w:t>Random Forest (Baseline 39 base)</w:t>
             </w:r>
           </w:p>
         </w:tc>
@@ -1081,7 +1081,7 @@
               <w:rPr>
                 <w:sz w:val="18"/>
               </w:rPr>
-              <w:t>0.3925 ± 0.064</w:t>
+              <w:t>0.3742 ± 0.059</w:t>
             </w:r>
           </w:p>
         </w:tc>
@@ -1095,7 +1095,7 @@
               <w:rPr>
                 <w:sz w:val="18"/>
               </w:rPr>
-              <w:t>0.5180 ± 0.092</w:t>
+              <w:t>0.5139 ± 0.092</w:t>
             </w:r>
           </w:p>
         </w:tc>
@@ -1109,7 +1109,7 @@
               <w:rPr>
                 <w:sz w:val="18"/>
               </w:rPr>
-              <w:t>0.5811</w:t>
+              <w:t>0.5859</w:t>
             </w:r>
           </w:p>
         </w:tc>
@@ -1123,7 +1123,7 @@
               <w:rPr>
                 <w:sz w:val="18"/>
               </w:rPr>
-              <w:t>486 ms</w:t>
+              <w:t>1670 ms</w:t>
             </w:r>
           </w:p>
         </w:tc>
@@ -1139,7 +1139,7 @@
               <w:rPr>
                 <w:sz w:val="18"/>
               </w:rPr>
-              <w:t>SVR (Kernel RBF + RobustScaler)</w:t>
+              <w:t>RidgeCV Lineal Regularizado</w:t>
             </w:r>
           </w:p>
         </w:tc>
@@ -1167,7 +1167,7 @@
               <w:rPr>
                 <w:sz w:val="18"/>
               </w:rPr>
-              <w:t>0.3675 ± 0.077</w:t>
+              <w:t>0.3819 ± 0.061</w:t>
             </w:r>
           </w:p>
         </w:tc>
@@ -1181,7 +1181,7 @@
               <w:rPr>
                 <w:sz w:val="18"/>
               </w:rPr>
-              <w:t>0.5189 ± 0.116</w:t>
+              <w:t>0.5180 ± 0.085</w:t>
             </w:r>
           </w:p>
         </w:tc>
@@ -1195,7 +1195,7 @@
               <w:rPr>
                 <w:sz w:val="18"/>
               </w:rPr>
-              <w:t>0.5763</w:t>
+              <w:t>0.5802</w:t>
             </w:r>
           </w:p>
         </w:tc>
@@ -1209,7 +1209,7 @@
               <w:rPr>
                 <w:sz w:val="18"/>
               </w:rPr>
-              <w:t>56 ms</w:t>
+              <w:t>58 ms</w:t>
             </w:r>
           </w:p>
         </w:tc>
@@ -1225,6 +1225,92 @@
               <w:rPr>
                 <w:sz w:val="18"/>
               </w:rPr>
+              <w:t>SVR (Kernel RBF + RobustScaler)</w:t>
+            </w:r>
+          </w:p>
+        </w:tc>
+        <w:tc>
+          <w:tcPr>
+            <w:tcW w:type="dxa" w:w="1608"/>
+            <w:shd w:val="clear" w:color="auto" w:fill="FFFFFF"/>
+          </w:tcPr>
+          <w:p>
+            <w:r>
+              <w:rPr>
+                <w:sz w:val="18"/>
+              </w:rPr>
+              <w:t>39 base</w:t>
+            </w:r>
+          </w:p>
+        </w:tc>
+        <w:tc>
+          <w:tcPr>
+            <w:tcW w:type="dxa" w:w="1608"/>
+            <w:shd w:val="clear" w:color="auto" w:fill="FFFFFF"/>
+          </w:tcPr>
+          <w:p>
+            <w:r>
+              <w:rPr>
+                <w:sz w:val="18"/>
+              </w:rPr>
+              <w:t>0.3682 ± 0.078</w:t>
+            </w:r>
+          </w:p>
+        </w:tc>
+        <w:tc>
+          <w:tcPr>
+            <w:tcW w:type="dxa" w:w="1608"/>
+            <w:shd w:val="clear" w:color="auto" w:fill="FFFFFF"/>
+          </w:tcPr>
+          <w:p>
+            <w:r>
+              <w:rPr>
+                <w:sz w:val="18"/>
+              </w:rPr>
+              <w:t>0.5210 ± 0.117</w:t>
+            </w:r>
+          </w:p>
+        </w:tc>
+        <w:tc>
+          <w:tcPr>
+            <w:tcW w:type="dxa" w:w="1608"/>
+            <w:shd w:val="clear" w:color="auto" w:fill="FFFFFF"/>
+          </w:tcPr>
+          <w:p>
+            <w:r>
+              <w:rPr>
+                <w:sz w:val="18"/>
+              </w:rPr>
+              <w:t>0.5729</w:t>
+            </w:r>
+          </w:p>
+        </w:tc>
+        <w:tc>
+          <w:tcPr>
+            <w:tcW w:type="dxa" w:w="1608"/>
+            <w:shd w:val="clear" w:color="auto" w:fill="FFFFFF"/>
+          </w:tcPr>
+          <w:p>
+            <w:r>
+              <w:rPr>
+                <w:sz w:val="18"/>
+              </w:rPr>
+              <w:t>58 ms</w:t>
+            </w:r>
+          </w:p>
+        </w:tc>
+      </w:tr>
+      <w:tr>
+        <w:tc>
+          <w:tcPr>
+            <w:tcW w:type="dxa" w:w="1608"/>
+            <w:shd w:val="clear" w:color="auto" w:fill="FAFAFA"/>
+          </w:tcPr>
+          <w:p>
+            <w:r>
+              <w:rPr>
+                <w:sz w:val="18"/>
+              </w:rPr>
               <w:t>LightGBM Regressor</w:t>
             </w:r>
           </w:p>
@@ -1232,7 +1318,7 @@
         <w:tc>
           <w:tcPr>
             <w:tcW w:type="dxa" w:w="1608"/>
-            <w:shd w:val="clear" w:color="auto" w:fill="FFFFFF"/>
+            <w:shd w:val="clear" w:color="auto" w:fill="FAFAFA"/>
           </w:tcPr>
           <w:p>
             <w:r>
@@ -1246,56 +1332,56 @@
         <w:tc>
           <w:tcPr>
             <w:tcW w:type="dxa" w:w="1608"/>
-            <w:shd w:val="clear" w:color="auto" w:fill="FFFFFF"/>
+            <w:shd w:val="clear" w:color="auto" w:fill="FAFAFA"/>
           </w:tcPr>
           <w:p>
             <w:r>
               <w:rPr>
                 <w:sz w:val="18"/>
               </w:rPr>
-              <w:t>0.4239 ± 0.064</w:t>
-            </w:r>
-          </w:p>
-        </w:tc>
-        <w:tc>
-          <w:tcPr>
-            <w:tcW w:type="dxa" w:w="1608"/>
-            <w:shd w:val="clear" w:color="auto" w:fill="FFFFFF"/>
+              <w:t>0.4198 ± 0.065</w:t>
+            </w:r>
+          </w:p>
+        </w:tc>
+        <w:tc>
+          <w:tcPr>
+            <w:tcW w:type="dxa" w:w="1608"/>
+            <w:shd w:val="clear" w:color="auto" w:fill="FAFAFA"/>
           </w:tcPr>
           <w:p>
             <w:r>
               <w:rPr>
                 <w:sz w:val="18"/>
               </w:rPr>
-              <w:t>0.5535 ± 0.091</w:t>
-            </w:r>
-          </w:p>
-        </w:tc>
-        <w:tc>
-          <w:tcPr>
-            <w:tcW w:type="dxa" w:w="1608"/>
-            <w:shd w:val="clear" w:color="auto" w:fill="FFFFFF"/>
+              <w:t>0.5494 ± 0.092</w:t>
+            </w:r>
+          </w:p>
+        </w:tc>
+        <w:tc>
+          <w:tcPr>
+            <w:tcW w:type="dxa" w:w="1608"/>
+            <w:shd w:val="clear" w:color="auto" w:fill="FAFAFA"/>
           </w:tcPr>
           <w:p>
             <w:r>
               <w:rPr>
                 <w:sz w:val="18"/>
               </w:rPr>
-              <w:t>0.5239</w:t>
-            </w:r>
-          </w:p>
-        </w:tc>
-        <w:tc>
-          <w:tcPr>
-            <w:tcW w:type="dxa" w:w="1608"/>
-            <w:shd w:val="clear" w:color="auto" w:fill="FFFFFF"/>
+              <w:t>0.5321</w:t>
+            </w:r>
+          </w:p>
+        </w:tc>
+        <w:tc>
+          <w:tcPr>
+            <w:tcW w:type="dxa" w:w="1608"/>
+            <w:shd w:val="clear" w:color="auto" w:fill="FAFAFA"/>
           </w:tcPr>
           <w:p>
             <w:r>
               <w:rPr>
                 <w:sz w:val="18"/>
               </w:rPr>
-              <w:t>116 ms</w:t>
+              <w:t>104 ms</w:t>
             </w:r>
           </w:p>
         </w:tc>
@@ -1350,7 +1436,7 @@
           <w:i/>
           <w:sz w:val="18"/>
         </w:rPr>
-        <w:t>Figura 2. Desempeño Out-Of-Fold en las 138 parcelas de entrenamiento. El 74.6% de las parcelas se ubica dentro de la banda de ±0.50 t/ha (MAPE = 10.46%).</w:t>
+        <w:t>Figura 2. Desempeño Out-Of-Fold en las 138 parcelas de entrenamiento. El 73.2% de las parcelas se ubica dentro de la banda de ±0.50 t/ha (MAPE = 10.18%).</w:t>
       </w:r>
     </w:p>
     <w:p>
@@ -1438,7 +1524,7 @@
     </w:p>
     <w:p>
       <w:r>
-        <w:t>A continuación se presenta la tabla íntegra con las 59 predicciones generadas por el modelo ganador (Ensemble Agrotec-Amanteca (Voting)). El rendimiento medio predicho es de 3.930 t/ha (desviación estándar de 0.690 t/ha, rango 2.66 a 5.04 t/ha), estimando una cosecha total de 1533.19 toneladas en las 393.57 hectáreas del conjunto de prueba.</w:t>
+        <w:t>A continuación se presenta la tabla íntegra con las 59 predicciones generadas por el modelo ganador (Ensemble Agrotec V3 (Smart-Pearson + IDW)). El rendimiento medio predicho es de 3.947 t/ha (desviación estándar de 0.696 t/ha, rango 2.72 a 5.06 t/ha), estimando una cosecha total de 1538.98 toneladas en las 393.57 hectáreas del conjunto de prueba.</w:t>
       </w:r>
     </w:p>
     <w:tbl>
@@ -1600,7 +1686,7 @@
               <w:rPr>
                 <w:sz w:val="17"/>
               </w:rPr>
-              <w:t>3.3693</w:t>
+              <w:t>3.4341</w:t>
             </w:r>
           </w:p>
         </w:tc>
@@ -1614,7 +1700,7 @@
               <w:rPr>
                 <w:sz w:val="17"/>
               </w:rPr>
-              <w:t>±0.388</w:t>
+              <w:t>±0.482</w:t>
             </w:r>
           </w:p>
         </w:tc>
@@ -1628,7 +1714,7 @@
               <w:rPr>
                 <w:sz w:val="17"/>
               </w:rPr>
-              <w:t>62.94</w:t>
+              <w:t>64.15</w:t>
             </w:r>
           </w:p>
         </w:tc>
@@ -1686,7 +1772,7 @@
               <w:rPr>
                 <w:sz w:val="17"/>
               </w:rPr>
-              <w:t>4.5870</w:t>
+              <w:t>4.5543</w:t>
             </w:r>
           </w:p>
         </w:tc>
@@ -1700,7 +1786,7 @@
               <w:rPr>
                 <w:sz w:val="17"/>
               </w:rPr>
-              <w:t>±0.314</w:t>
+              <w:t>±0.342</w:t>
             </w:r>
           </w:p>
         </w:tc>
@@ -1714,7 +1800,7 @@
               <w:rPr>
                 <w:sz w:val="17"/>
               </w:rPr>
-              <w:t>32.89</w:t>
+              <w:t>32.65</w:t>
             </w:r>
           </w:p>
         </w:tc>
@@ -1772,7 +1858,7 @@
               <w:rPr>
                 <w:sz w:val="17"/>
               </w:rPr>
-              <w:t>4.4587</w:t>
+              <w:t>4.3432</w:t>
             </w:r>
           </w:p>
         </w:tc>
@@ -1786,7 +1872,7 @@
               <w:rPr>
                 <w:sz w:val="17"/>
               </w:rPr>
-              <w:t>±0.171</w:t>
+              <w:t>±0.247</w:t>
             </w:r>
           </w:p>
         </w:tc>
@@ -1800,7 +1886,7 @@
               <w:rPr>
                 <w:sz w:val="17"/>
               </w:rPr>
-              <w:t>33.31</w:t>
+              <w:t>32.44</w:t>
             </w:r>
           </w:p>
         </w:tc>
@@ -1858,7 +1944,7 @@
               <w:rPr>
                 <w:sz w:val="17"/>
               </w:rPr>
-              <w:t>2.9190</w:t>
+              <w:t>2.9631</w:t>
             </w:r>
           </w:p>
         </w:tc>
@@ -1872,7 +1958,7 @@
               <w:rPr>
                 <w:sz w:val="17"/>
               </w:rPr>
-              <w:t>±0.209</w:t>
+              <w:t>±0.253</w:t>
             </w:r>
           </w:p>
         </w:tc>
@@ -1886,7 +1972,7 @@
               <w:rPr>
                 <w:sz w:val="17"/>
               </w:rPr>
-              <w:t>5.84</w:t>
+              <w:t>5.93</w:t>
             </w:r>
           </w:p>
         </w:tc>
@@ -1944,7 +2030,7 @@
               <w:rPr>
                 <w:sz w:val="17"/>
               </w:rPr>
-              <w:t>3.3068</w:t>
+              <w:t>3.3023</w:t>
             </w:r>
           </w:p>
         </w:tc>
@@ -1958,7 +2044,7 @@
               <w:rPr>
                 <w:sz w:val="17"/>
               </w:rPr>
-              <w:t>±0.276</w:t>
+              <w:t>±0.258</w:t>
             </w:r>
           </w:p>
         </w:tc>
@@ -1972,7 +2058,7 @@
               <w:rPr>
                 <w:sz w:val="17"/>
               </w:rPr>
-              <w:t>27.98</w:t>
+              <w:t>27.94</w:t>
             </w:r>
           </w:p>
         </w:tc>
@@ -2030,7 +2116,7 @@
               <w:rPr>
                 <w:sz w:val="17"/>
               </w:rPr>
-              <w:t>4.5528</w:t>
+              <w:t>4.6201</w:t>
             </w:r>
           </w:p>
         </w:tc>
@@ -2044,7 +2130,7 @@
               <w:rPr>
                 <w:sz w:val="17"/>
               </w:rPr>
-              <w:t>±0.202</w:t>
+              <w:t>±0.252</w:t>
             </w:r>
           </w:p>
         </w:tc>
@@ -2058,7 +2144,7 @@
               <w:rPr>
                 <w:sz w:val="17"/>
               </w:rPr>
-              <w:t>8.47</w:t>
+              <w:t>8.59</w:t>
             </w:r>
           </w:p>
         </w:tc>
@@ -2116,7 +2202,7 @@
               <w:rPr>
                 <w:sz w:val="17"/>
               </w:rPr>
-              <w:t>3.3105</w:t>
+              <w:t>3.2279</w:t>
             </w:r>
           </w:p>
         </w:tc>
@@ -2130,7 +2216,7 @@
               <w:rPr>
                 <w:sz w:val="17"/>
               </w:rPr>
-              <w:t>±0.325</w:t>
+              <w:t>±0.441</w:t>
             </w:r>
           </w:p>
         </w:tc>
@@ -2144,7 +2230,7 @@
               <w:rPr>
                 <w:sz w:val="17"/>
               </w:rPr>
-              <w:t>19.53</w:t>
+              <w:t>19.04</w:t>
             </w:r>
           </w:p>
         </w:tc>
@@ -2202,7 +2288,7 @@
               <w:rPr>
                 <w:sz w:val="17"/>
               </w:rPr>
-              <w:t>3.2132</w:t>
+              <w:t>3.1385</w:t>
             </w:r>
           </w:p>
         </w:tc>
@@ -2216,7 +2302,7 @@
               <w:rPr>
                 <w:sz w:val="17"/>
               </w:rPr>
-              <w:t>±0.141</w:t>
+              <w:t>±0.232</w:t>
             </w:r>
           </w:p>
         </w:tc>
@@ -2230,7 +2316,7 @@
               <w:rPr>
                 <w:sz w:val="17"/>
               </w:rPr>
-              <w:t>41.93</w:t>
+              <w:t>40.96</w:t>
             </w:r>
           </w:p>
         </w:tc>
@@ -2288,7 +2374,7 @@
               <w:rPr>
                 <w:sz w:val="17"/>
               </w:rPr>
-              <w:t>4.5546</w:t>
+              <w:t>4.3618</w:t>
             </w:r>
           </w:p>
         </w:tc>
@@ -2302,7 +2388,7 @@
               <w:rPr>
                 <w:sz w:val="17"/>
               </w:rPr>
-              <w:t>±0.240</w:t>
+              <w:t>±0.608</w:t>
             </w:r>
           </w:p>
         </w:tc>
@@ -2316,7 +2402,7 @@
               <w:rPr>
                 <w:sz w:val="17"/>
               </w:rPr>
-              <w:t>9.02</w:t>
+              <w:t>8.64</w:t>
             </w:r>
           </w:p>
         </w:tc>
@@ -2374,7 +2460,7 @@
               <w:rPr>
                 <w:sz w:val="17"/>
               </w:rPr>
-              <w:t>4.1544</w:t>
+              <w:t>4.3062</w:t>
             </w:r>
           </w:p>
         </w:tc>
@@ -2388,7 +2474,7 @@
               <w:rPr>
                 <w:sz w:val="17"/>
               </w:rPr>
-              <w:t>±0.356</w:t>
+              <w:t>±0.154</w:t>
             </w:r>
           </w:p>
         </w:tc>
@@ -2402,7 +2488,7 @@
               <w:rPr>
                 <w:sz w:val="17"/>
               </w:rPr>
-              <w:t>20.77</w:t>
+              <w:t>21.53</w:t>
             </w:r>
           </w:p>
         </w:tc>
@@ -2460,7 +2546,7 @@
               <w:rPr>
                 <w:sz w:val="17"/>
               </w:rPr>
-              <w:t>2.8845</w:t>
+              <w:t>2.8964</w:t>
             </w:r>
           </w:p>
         </w:tc>
@@ -2474,7 +2560,7 @@
               <w:rPr>
                 <w:sz w:val="17"/>
               </w:rPr>
-              <w:t>±0.182</w:t>
+              <w:t>±0.204</w:t>
             </w:r>
           </w:p>
         </w:tc>
@@ -2488,7 +2574,7 @@
               <w:rPr>
                 <w:sz w:val="17"/>
               </w:rPr>
-              <w:t>22.24</w:t>
+              <w:t>22.33</w:t>
             </w:r>
           </w:p>
         </w:tc>
@@ -2546,7 +2632,7 @@
               <w:rPr>
                 <w:sz w:val="17"/>
               </w:rPr>
-              <w:t>3.0451</w:t>
+              <w:t>3.0833</w:t>
             </w:r>
           </w:p>
         </w:tc>
@@ -2560,7 +2646,7 @@
               <w:rPr>
                 <w:sz w:val="17"/>
               </w:rPr>
-              <w:t>±0.304</w:t>
+              <w:t>±0.191</w:t>
             </w:r>
           </w:p>
         </w:tc>
@@ -2574,7 +2660,7 @@
               <w:rPr>
                 <w:sz w:val="17"/>
               </w:rPr>
-              <w:t>11.60</w:t>
+              <w:t>11.75</w:t>
             </w:r>
           </w:p>
         </w:tc>
@@ -2632,7 +2718,7 @@
               <w:rPr>
                 <w:sz w:val="17"/>
               </w:rPr>
-              <w:t>4.4343</w:t>
+              <w:t>4.4307</w:t>
             </w:r>
           </w:p>
         </w:tc>
@@ -2646,7 +2732,7 @@
               <w:rPr>
                 <w:sz w:val="17"/>
               </w:rPr>
-              <w:t>±0.208</w:t>
+              <w:t>±0.308</w:t>
             </w:r>
           </w:p>
         </w:tc>
@@ -2660,7 +2746,7 @@
               <w:rPr>
                 <w:sz w:val="17"/>
               </w:rPr>
-              <w:t>31.71</w:t>
+              <w:t>31.68</w:t>
             </w:r>
           </w:p>
         </w:tc>
@@ -2718,7 +2804,7 @@
               <w:rPr>
                 <w:sz w:val="17"/>
               </w:rPr>
-              <w:t>2.9444</w:t>
+              <w:t>2.9755</w:t>
             </w:r>
           </w:p>
         </w:tc>
@@ -2732,7 +2818,7 @@
               <w:rPr>
                 <w:sz w:val="17"/>
               </w:rPr>
-              <w:t>±0.137</w:t>
+              <w:t>±0.161</w:t>
             </w:r>
           </w:p>
         </w:tc>
@@ -2746,7 +2832,7 @@
               <w:rPr>
                 <w:sz w:val="17"/>
               </w:rPr>
-              <w:t>7.13</w:t>
+              <w:t>7.20</w:t>
             </w:r>
           </w:p>
         </w:tc>
@@ -2804,7 +2890,7 @@
               <w:rPr>
                 <w:sz w:val="17"/>
               </w:rPr>
-              <w:t>4.4179</w:t>
+              <w:t>4.3706</w:t>
             </w:r>
           </w:p>
         </w:tc>
@@ -2818,7 +2904,7 @@
               <w:rPr>
                 <w:sz w:val="17"/>
               </w:rPr>
-              <w:t>±0.252</w:t>
+              <w:t>±0.302</w:t>
             </w:r>
           </w:p>
         </w:tc>
@@ -2832,7 +2918,7 @@
               <w:rPr>
                 <w:sz w:val="17"/>
               </w:rPr>
-              <w:t>27.52</w:t>
+              <w:t>27.23</w:t>
             </w:r>
           </w:p>
         </w:tc>
@@ -2890,7 +2976,7 @@
               <w:rPr>
                 <w:sz w:val="17"/>
               </w:rPr>
-              <w:t>2.7916</w:t>
+              <w:t>2.9972</w:t>
             </w:r>
           </w:p>
         </w:tc>
@@ -2904,7 +2990,7 @@
               <w:rPr>
                 <w:sz w:val="17"/>
               </w:rPr>
-              <w:t>±0.358</w:t>
+              <w:t>±0.229</w:t>
             </w:r>
           </w:p>
         </w:tc>
@@ -2918,7 +3004,7 @@
               <w:rPr>
                 <w:sz w:val="17"/>
               </w:rPr>
-              <w:t>20.18</w:t>
+              <w:t>21.67</w:t>
             </w:r>
           </w:p>
         </w:tc>
@@ -2976,7 +3062,7 @@
               <w:rPr>
                 <w:sz w:val="17"/>
               </w:rPr>
-              <w:t>4.4329</w:t>
+              <w:t>4.3841</w:t>
             </w:r>
           </w:p>
         </w:tc>
@@ -2990,7 +3076,7 @@
               <w:rPr>
                 <w:sz w:val="17"/>
               </w:rPr>
-              <w:t>±0.233</w:t>
+              <w:t>±0.205</w:t>
             </w:r>
           </w:p>
         </w:tc>
@@ -3004,7 +3090,7 @@
               <w:rPr>
                 <w:sz w:val="17"/>
               </w:rPr>
-              <w:t>55.59</w:t>
+              <w:t>54.98</w:t>
             </w:r>
           </w:p>
         </w:tc>
@@ -3062,7 +3148,7 @@
               <w:rPr>
                 <w:sz w:val="17"/>
               </w:rPr>
-              <w:t>4.3544</w:t>
+              <w:t>4.3830</w:t>
             </w:r>
           </w:p>
         </w:tc>
@@ -3076,7 +3162,7 @@
               <w:rPr>
                 <w:sz w:val="17"/>
               </w:rPr>
-              <w:t>±0.293</w:t>
+              <w:t>±0.157</w:t>
             </w:r>
           </w:p>
         </w:tc>
@@ -3090,7 +3176,7 @@
               <w:rPr>
                 <w:sz w:val="17"/>
               </w:rPr>
-              <w:t>265.10</w:t>
+              <w:t>266.84</w:t>
             </w:r>
           </w:p>
         </w:tc>
@@ -3148,7 +3234,7 @@
               <w:rPr>
                 <w:sz w:val="17"/>
               </w:rPr>
-              <w:t>3.0547</w:t>
+              <w:t>2.9987</w:t>
             </w:r>
           </w:p>
         </w:tc>
@@ -3162,7 +3248,7 @@
               <w:rPr>
                 <w:sz w:val="17"/>
               </w:rPr>
-              <w:t>±0.222</w:t>
+              <w:t>±0.228</w:t>
             </w:r>
           </w:p>
         </w:tc>
@@ -3176,7 +3262,7 @@
               <w:rPr>
                 <w:sz w:val="17"/>
               </w:rPr>
-              <w:t>15.91</w:t>
+              <w:t>15.62</w:t>
             </w:r>
           </w:p>
         </w:tc>
@@ -3234,7 +3320,7 @@
               <w:rPr>
                 <w:sz w:val="17"/>
               </w:rPr>
-              <w:t>3.1847</w:t>
+              <w:t>3.0105</w:t>
             </w:r>
           </w:p>
         </w:tc>
@@ -3248,7 +3334,7 @@
               <w:rPr>
                 <w:sz w:val="17"/>
               </w:rPr>
-              <w:t>±0.234</w:t>
+              <w:t>±0.281</w:t>
             </w:r>
           </w:p>
         </w:tc>
@@ -3262,7 +3348,7 @@
               <w:rPr>
                 <w:sz w:val="17"/>
               </w:rPr>
-              <w:t>12.42</w:t>
+              <w:t>11.74</w:t>
             </w:r>
           </w:p>
         </w:tc>
@@ -3320,7 +3406,7 @@
               <w:rPr>
                 <w:sz w:val="17"/>
               </w:rPr>
-              <w:t>4.5116</w:t>
+              <w:t>4.5532</w:t>
             </w:r>
           </w:p>
         </w:tc>
@@ -3334,7 +3420,7 @@
               <w:rPr>
                 <w:sz w:val="17"/>
               </w:rPr>
-              <w:t>±0.263</w:t>
+              <w:t>±0.286</w:t>
             </w:r>
           </w:p>
         </w:tc>
@@ -3348,7 +3434,7 @@
               <w:rPr>
                 <w:sz w:val="17"/>
               </w:rPr>
-              <w:t>4.56</w:t>
+              <w:t>4.60</w:t>
             </w:r>
           </w:p>
         </w:tc>
@@ -3406,7 +3492,7 @@
               <w:rPr>
                 <w:sz w:val="17"/>
               </w:rPr>
-              <w:t>4.4309</w:t>
+              <w:t>4.4575</w:t>
             </w:r>
           </w:p>
         </w:tc>
@@ -3420,7 +3506,7 @@
               <w:rPr>
                 <w:sz w:val="17"/>
               </w:rPr>
-              <w:t>±0.192</w:t>
+              <w:t>±0.100</w:t>
             </w:r>
           </w:p>
         </w:tc>
@@ -3434,7 +3520,7 @@
               <w:rPr>
                 <w:sz w:val="17"/>
               </w:rPr>
-              <w:t>12.27</w:t>
+              <w:t>12.35</w:t>
             </w:r>
           </w:p>
         </w:tc>
@@ -3492,7 +3578,7 @@
               <w:rPr>
                 <w:sz w:val="17"/>
               </w:rPr>
-              <w:t>4.2099</w:t>
+              <w:t>4.1221</w:t>
             </w:r>
           </w:p>
         </w:tc>
@@ -3506,7 +3592,7 @@
               <w:rPr>
                 <w:sz w:val="17"/>
               </w:rPr>
-              <w:t>±0.309</w:t>
+              <w:t>±0.267</w:t>
             </w:r>
           </w:p>
         </w:tc>
@@ -3520,7 +3606,7 @@
               <w:rPr>
                 <w:sz w:val="17"/>
               </w:rPr>
-              <w:t>23.15</w:t>
+              <w:t>22.67</w:t>
             </w:r>
           </w:p>
         </w:tc>
@@ -3578,7 +3664,7 @@
               <w:rPr>
                 <w:sz w:val="17"/>
               </w:rPr>
-              <w:t>2.9446</w:t>
+              <w:t>2.9750</w:t>
             </w:r>
           </w:p>
         </w:tc>
@@ -3592,7 +3678,7 @@
               <w:rPr>
                 <w:sz w:val="17"/>
               </w:rPr>
-              <w:t>±0.136</w:t>
+              <w:t>±0.159</w:t>
             </w:r>
           </w:p>
         </w:tc>
@@ -3606,7 +3692,7 @@
               <w:rPr>
                 <w:sz w:val="17"/>
               </w:rPr>
-              <w:t>13.93</w:t>
+              <w:t>14.07</w:t>
             </w:r>
           </w:p>
         </w:tc>
@@ -3664,7 +3750,7 @@
               <w:rPr>
                 <w:sz w:val="17"/>
               </w:rPr>
-              <w:t>2.6640</w:t>
+              <w:t>2.7192</w:t>
             </w:r>
           </w:p>
         </w:tc>
@@ -3678,7 +3764,7 @@
               <w:rPr>
                 <w:sz w:val="17"/>
               </w:rPr>
-              <w:t>±0.285</w:t>
+              <w:t>±0.166</w:t>
             </w:r>
           </w:p>
         </w:tc>
@@ -3692,7 +3778,7 @@
               <w:rPr>
                 <w:sz w:val="17"/>
               </w:rPr>
-              <w:t>15.08</w:t>
+              <w:t>15.39</w:t>
             </w:r>
           </w:p>
         </w:tc>
@@ -3750,7 +3836,7 @@
               <w:rPr>
                 <w:sz w:val="17"/>
               </w:rPr>
-              <w:t>4.3847</w:t>
+              <w:t>4.3205</w:t>
             </w:r>
           </w:p>
         </w:tc>
@@ -3764,7 +3850,7 @@
               <w:rPr>
                 <w:sz w:val="17"/>
               </w:rPr>
-              <w:t>±0.162</w:t>
+              <w:t>±0.181</w:t>
             </w:r>
           </w:p>
         </w:tc>
@@ -3778,7 +3864,7 @@
               <w:rPr>
                 <w:sz w:val="17"/>
               </w:rPr>
-              <w:t>25.91</w:t>
+              <w:t>25.53</w:t>
             </w:r>
           </w:p>
         </w:tc>
@@ -3836,7 +3922,7 @@
               <w:rPr>
                 <w:sz w:val="17"/>
               </w:rPr>
-              <w:t>4.6077</w:t>
+              <w:t>4.7805</w:t>
             </w:r>
           </w:p>
         </w:tc>
@@ -3850,7 +3936,7 @@
               <w:rPr>
                 <w:sz w:val="17"/>
               </w:rPr>
-              <w:t>±0.279</w:t>
+              <w:t>±0.316</w:t>
             </w:r>
           </w:p>
         </w:tc>
@@ -3864,7 +3950,7 @@
               <w:rPr>
                 <w:sz w:val="17"/>
               </w:rPr>
-              <w:t>1.61</w:t>
+              <w:t>1.67</w:t>
             </w:r>
           </w:p>
         </w:tc>
@@ -3922,7 +4008,7 @@
               <w:rPr>
                 <w:sz w:val="17"/>
               </w:rPr>
-              <w:t>3.1793</w:t>
+              <w:t>3.0720</w:t>
             </w:r>
           </w:p>
         </w:tc>
@@ -3936,7 +4022,7 @@
               <w:rPr>
                 <w:sz w:val="17"/>
               </w:rPr>
-              <w:t>±0.216</w:t>
+              <w:t>±0.323</w:t>
             </w:r>
           </w:p>
         </w:tc>
@@ -3950,7 +4036,7 @@
               <w:rPr>
                 <w:sz w:val="17"/>
               </w:rPr>
-              <w:t>11.80</w:t>
+              <w:t>11.40</w:t>
             </w:r>
           </w:p>
         </w:tc>
@@ -4008,7 +4094,7 @@
               <w:rPr>
                 <w:sz w:val="17"/>
               </w:rPr>
-              <w:t>4.7394</w:t>
+              <w:t>4.7520</w:t>
             </w:r>
           </w:p>
         </w:tc>
@@ -4022,7 +4108,7 @@
               <w:rPr>
                 <w:sz w:val="17"/>
               </w:rPr>
-              <w:t>±0.258</w:t>
+              <w:t>±0.184</w:t>
             </w:r>
           </w:p>
         </w:tc>
@@ -4036,7 +4122,7 @@
               <w:rPr>
                 <w:sz w:val="17"/>
               </w:rPr>
-              <w:t>17.20</w:t>
+              <w:t>17.25</w:t>
             </w:r>
           </w:p>
         </w:tc>
@@ -4094,7 +4180,7 @@
               <w:rPr>
                 <w:sz w:val="17"/>
               </w:rPr>
-              <w:t>4.4753</w:t>
+              <w:t>4.5286</w:t>
             </w:r>
           </w:p>
         </w:tc>
@@ -4108,7 +4194,7 @@
               <w:rPr>
                 <w:sz w:val="17"/>
               </w:rPr>
-              <w:t>±0.205</w:t>
+              <w:t>±0.237</w:t>
             </w:r>
           </w:p>
         </w:tc>
@@ -4122,7 +4208,7 @@
               <w:rPr>
                 <w:sz w:val="17"/>
               </w:rPr>
-              <w:t>5.95</w:t>
+              <w:t>6.02</w:t>
             </w:r>
           </w:p>
         </w:tc>
@@ -4180,7 +4266,7 @@
               <w:rPr>
                 <w:sz w:val="17"/>
               </w:rPr>
-              <w:t>4.5067</w:t>
+              <w:t>4.5233</w:t>
             </w:r>
           </w:p>
         </w:tc>
@@ -4194,7 +4280,7 @@
               <w:rPr>
                 <w:sz w:val="17"/>
               </w:rPr>
-              <w:t>±0.173</w:t>
+              <w:t>±0.282</w:t>
             </w:r>
           </w:p>
         </w:tc>
@@ -4208,7 +4294,7 @@
               <w:rPr>
                 <w:sz w:val="17"/>
               </w:rPr>
-              <w:t>11.85</w:t>
+              <w:t>11.90</w:t>
             </w:r>
           </w:p>
         </w:tc>
@@ -4266,7 +4352,7 @@
               <w:rPr>
                 <w:sz w:val="17"/>
               </w:rPr>
-              <w:t>3.1135</w:t>
+              <w:t>3.0071</w:t>
             </w:r>
           </w:p>
         </w:tc>
@@ -4280,7 +4366,7 @@
               <w:rPr>
                 <w:sz w:val="17"/>
               </w:rPr>
-              <w:t>±0.252</w:t>
+              <w:t>±0.325</w:t>
             </w:r>
           </w:p>
         </w:tc>
@@ -4294,7 +4380,7 @@
               <w:rPr>
                 <w:sz w:val="17"/>
               </w:rPr>
-              <w:t>32.94</w:t>
+              <w:t>31.82</w:t>
             </w:r>
           </w:p>
         </w:tc>
@@ -4352,7 +4438,7 @@
               <w:rPr>
                 <w:sz w:val="17"/>
               </w:rPr>
-              <w:t>4.3327</w:t>
+              <w:t>4.3532</w:t>
             </w:r>
           </w:p>
         </w:tc>
@@ -4366,7 +4452,7 @@
               <w:rPr>
                 <w:sz w:val="17"/>
               </w:rPr>
-              <w:t>±0.259</w:t>
+              <w:t>±0.158</w:t>
             </w:r>
           </w:p>
         </w:tc>
@@ -4380,7 +4466,7 @@
               <w:rPr>
                 <w:sz w:val="17"/>
               </w:rPr>
-              <w:t>32.19</w:t>
+              <w:t>32.34</w:t>
             </w:r>
           </w:p>
         </w:tc>
@@ -4438,7 +4524,7 @@
               <w:rPr>
                 <w:sz w:val="17"/>
               </w:rPr>
-              <w:t>3.2650</w:t>
+              <w:t>3.1266</w:t>
             </w:r>
           </w:p>
         </w:tc>
@@ -4452,7 +4538,7 @@
               <w:rPr>
                 <w:sz w:val="17"/>
               </w:rPr>
-              <w:t>±0.349</w:t>
+              <w:t>±0.270</w:t>
             </w:r>
           </w:p>
         </w:tc>
@@ -4466,7 +4552,7 @@
               <w:rPr>
                 <w:sz w:val="17"/>
               </w:rPr>
-              <w:t>14.43</w:t>
+              <w:t>13.82</w:t>
             </w:r>
           </w:p>
         </w:tc>
@@ -4524,7 +4610,7 @@
               <w:rPr>
                 <w:sz w:val="17"/>
               </w:rPr>
-              <w:t>3.0613</w:t>
+              <w:t>3.3375</w:t>
             </w:r>
           </w:p>
         </w:tc>
@@ -4538,7 +4624,7 @@
               <w:rPr>
                 <w:sz w:val="17"/>
               </w:rPr>
-              <w:t>±0.392</w:t>
+              <w:t>±0.378</w:t>
             </w:r>
           </w:p>
         </w:tc>
@@ -4552,7 +4638,7 @@
               <w:rPr>
                 <w:sz w:val="17"/>
               </w:rPr>
-              <w:t>22.87</w:t>
+              <w:t>24.93</w:t>
             </w:r>
           </w:p>
         </w:tc>
@@ -4610,7 +4696,7 @@
               <w:rPr>
                 <w:sz w:val="17"/>
               </w:rPr>
-              <w:t>4.3207</w:t>
+              <w:t>4.3518</w:t>
             </w:r>
           </w:p>
         </w:tc>
@@ -4624,7 +4710,7 @@
               <w:rPr>
                 <w:sz w:val="17"/>
               </w:rPr>
-              <w:t>±0.187</w:t>
+              <w:t>±0.210</w:t>
             </w:r>
           </w:p>
         </w:tc>
@@ -4638,7 +4724,7 @@
               <w:rPr>
                 <w:sz w:val="17"/>
               </w:rPr>
-              <w:t>24.84</w:t>
+              <w:t>25.02</w:t>
             </w:r>
           </w:p>
         </w:tc>
@@ -4696,7 +4782,7 @@
               <w:rPr>
                 <w:sz w:val="17"/>
               </w:rPr>
-              <w:t>4.4223</w:t>
+              <w:t>4.3886</w:t>
             </w:r>
           </w:p>
         </w:tc>
@@ -4710,7 +4796,7 @@
               <w:rPr>
                 <w:sz w:val="17"/>
               </w:rPr>
-              <w:t>±0.123</w:t>
+              <w:t>±0.163</w:t>
             </w:r>
           </w:p>
         </w:tc>
@@ -4724,7 +4810,7 @@
               <w:rPr>
                 <w:sz w:val="17"/>
               </w:rPr>
-              <w:t>27.20</w:t>
+              <w:t>26.99</w:t>
             </w:r>
           </w:p>
         </w:tc>
@@ -4782,7 +4868,7 @@
               <w:rPr>
                 <w:sz w:val="17"/>
               </w:rPr>
-              <w:t>3.2864</w:t>
+              <w:t>3.2958</w:t>
             </w:r>
           </w:p>
         </w:tc>
@@ -4796,7 +4882,7 @@
               <w:rPr>
                 <w:sz w:val="17"/>
               </w:rPr>
-              <w:t>±0.403</w:t>
+              <w:t>±0.438</w:t>
             </w:r>
           </w:p>
         </w:tc>
@@ -4810,7 +4896,7 @@
               <w:rPr>
                 <w:sz w:val="17"/>
               </w:rPr>
-              <w:t>26.82</w:t>
+              <w:t>26.89</w:t>
             </w:r>
           </w:p>
         </w:tc>
@@ -4868,7 +4954,7 @@
               <w:rPr>
                 <w:sz w:val="17"/>
               </w:rPr>
-              <w:t>4.3547</w:t>
+              <w:t>4.3641</w:t>
             </w:r>
           </w:p>
         </w:tc>
@@ -4882,7 +4968,7 @@
               <w:rPr>
                 <w:sz w:val="17"/>
               </w:rPr>
-              <w:t>±0.340</w:t>
+              <w:t>±0.258</w:t>
             </w:r>
           </w:p>
         </w:tc>
@@ -4896,7 +4982,7 @@
               <w:rPr>
                 <w:sz w:val="17"/>
               </w:rPr>
-              <w:t>52.69</w:t>
+              <w:t>52.81</w:t>
             </w:r>
           </w:p>
         </w:tc>
@@ -4954,7 +5040,7 @@
               <w:rPr>
                 <w:sz w:val="17"/>
               </w:rPr>
-              <w:t>4.2869</w:t>
+              <w:t>4.2026</w:t>
             </w:r>
           </w:p>
         </w:tc>
@@ -4968,7 +5054,7 @@
               <w:rPr>
                 <w:sz w:val="17"/>
               </w:rPr>
-              <w:t>±0.230</w:t>
+              <w:t>±0.219</w:t>
             </w:r>
           </w:p>
         </w:tc>
@@ -4982,7 +5068,7 @@
               <w:rPr>
                 <w:sz w:val="17"/>
               </w:rPr>
-              <w:t>7.24</w:t>
+              <w:t>7.10</w:t>
             </w:r>
           </w:p>
         </w:tc>
@@ -5040,7 +5126,7 @@
               <w:rPr>
                 <w:sz w:val="17"/>
               </w:rPr>
-              <w:t>5.0438</w:t>
+              <w:t>5.0572</w:t>
             </w:r>
           </w:p>
         </w:tc>
@@ -5054,7 +5140,7 @@
               <w:rPr>
                 <w:sz w:val="17"/>
               </w:rPr>
-              <w:t>±0.380</w:t>
+              <w:t>±0.249</w:t>
             </w:r>
           </w:p>
         </w:tc>
@@ -5068,7 +5154,7 @@
               <w:rPr>
                 <w:sz w:val="17"/>
               </w:rPr>
-              <w:t>6.51</w:t>
+              <w:t>6.52</w:t>
             </w:r>
           </w:p>
         </w:tc>
@@ -5126,7 +5212,7 @@
               <w:rPr>
                 <w:sz w:val="17"/>
               </w:rPr>
-              <w:t>4.4687</w:t>
+              <w:t>4.5131</w:t>
             </w:r>
           </w:p>
         </w:tc>
@@ -5140,7 +5226,7 @@
               <w:rPr>
                 <w:sz w:val="17"/>
               </w:rPr>
-              <w:t>±0.187</w:t>
+              <w:t>±0.178</w:t>
             </w:r>
           </w:p>
         </w:tc>
@@ -5154,7 +5240,7 @@
               <w:rPr>
                 <w:sz w:val="17"/>
               </w:rPr>
-              <w:t>51.30</w:t>
+              <w:t>51.81</w:t>
             </w:r>
           </w:p>
         </w:tc>
@@ -5212,7 +5298,7 @@
               <w:rPr>
                 <w:sz w:val="17"/>
               </w:rPr>
-              <w:t>2.8891</w:t>
+              <w:t>3.0622</w:t>
             </w:r>
           </w:p>
         </w:tc>
@@ -5226,7 +5312,7 @@
               <w:rPr>
                 <w:sz w:val="17"/>
               </w:rPr>
-              <w:t>±0.246</w:t>
+              <w:t>±0.195</w:t>
             </w:r>
           </w:p>
         </w:tc>
@@ -5240,7 +5326,7 @@
               <w:rPr>
                 <w:sz w:val="17"/>
               </w:rPr>
-              <w:t>19.65</w:t>
+              <w:t>20.82</w:t>
             </w:r>
           </w:p>
         </w:tc>
@@ -5298,7 +5384,7 @@
               <w:rPr>
                 <w:sz w:val="17"/>
               </w:rPr>
-              <w:t>4.3640</w:t>
+              <w:t>4.3868</w:t>
             </w:r>
           </w:p>
         </w:tc>
@@ -5312,7 +5398,7 @@
               <w:rPr>
                 <w:sz w:val="17"/>
               </w:rPr>
-              <w:t>±0.255</w:t>
+              <w:t>±0.294</w:t>
             </w:r>
           </w:p>
         </w:tc>
@@ -5326,7 +5412,7 @@
               <w:rPr>
                 <w:sz w:val="17"/>
               </w:rPr>
-              <w:t>39.23</w:t>
+              <w:t>39.44</w:t>
             </w:r>
           </w:p>
         </w:tc>
@@ -5384,7 +5470,7 @@
               <w:rPr>
                 <w:sz w:val="17"/>
               </w:rPr>
-              <w:t>4.0749</w:t>
+              <w:t>4.2241</w:t>
             </w:r>
           </w:p>
         </w:tc>
@@ -5398,7 +5484,7 @@
               <w:rPr>
                 <w:sz w:val="17"/>
               </w:rPr>
-              <w:t>±0.344</w:t>
+              <w:t>±0.189</w:t>
             </w:r>
           </w:p>
         </w:tc>
@@ -5412,7 +5498,7 @@
               <w:rPr>
                 <w:sz w:val="17"/>
               </w:rPr>
-              <w:t>8.11</w:t>
+              <w:t>8.41</w:t>
             </w:r>
           </w:p>
         </w:tc>
@@ -5470,7 +5556,7 @@
               <w:rPr>
                 <w:sz w:val="17"/>
               </w:rPr>
-              <w:t>4.6065</w:t>
+              <w:t>4.6272</w:t>
             </w:r>
           </w:p>
         </w:tc>
@@ -5484,7 +5570,7 @@
               <w:rPr>
                 <w:sz w:val="17"/>
               </w:rPr>
-              <w:t>±0.192</w:t>
+              <w:t>±0.281</w:t>
             </w:r>
           </w:p>
         </w:tc>
@@ -5498,7 +5584,7 @@
               <w:rPr>
                 <w:sz w:val="17"/>
               </w:rPr>
-              <w:t>6.86</w:t>
+              <w:t>6.89</w:t>
             </w:r>
           </w:p>
         </w:tc>
@@ -5556,7 +5642,7 @@
               <w:rPr>
                 <w:sz w:val="17"/>
               </w:rPr>
-              <w:t>3.1802</w:t>
+              <w:t>3.1074</w:t>
             </w:r>
           </w:p>
         </w:tc>
@@ -5570,7 +5656,7 @@
               <w:rPr>
                 <w:sz w:val="17"/>
               </w:rPr>
-              <w:t>±0.169</w:t>
+              <w:t>±0.226</w:t>
             </w:r>
           </w:p>
         </w:tc>
@@ -5584,7 +5670,7 @@
               <w:rPr>
                 <w:sz w:val="17"/>
               </w:rPr>
-              <w:t>26.08</w:t>
+              <w:t>25.48</w:t>
             </w:r>
           </w:p>
         </w:tc>
@@ -5642,7 +5728,7 @@
               <w:rPr>
                 <w:sz w:val="17"/>
               </w:rPr>
-              <w:t>4.0854</w:t>
+              <w:t>4.2600</w:t>
             </w:r>
           </w:p>
         </w:tc>
@@ -5656,7 +5742,7 @@
               <w:rPr>
                 <w:sz w:val="17"/>
               </w:rPr>
-              <w:t>±0.441</w:t>
+              <w:t>±0.248</w:t>
             </w:r>
           </w:p>
         </w:tc>
@@ -5670,7 +5756,7 @@
               <w:rPr>
                 <w:sz w:val="17"/>
               </w:rPr>
-              <w:t>45.84</w:t>
+              <w:t>47.80</w:t>
             </w:r>
           </w:p>
         </w:tc>
@@ -5728,7 +5814,7 @@
               <w:rPr>
                 <w:sz w:val="17"/>
               </w:rPr>
-              <w:t>3.3509</w:t>
+              <w:t>3.4512</w:t>
             </w:r>
           </w:p>
         </w:tc>
@@ -5742,7 +5828,7 @@
               <w:rPr>
                 <w:sz w:val="17"/>
               </w:rPr>
-              <w:t>±0.436</w:t>
+              <w:t>±0.565</w:t>
             </w:r>
           </w:p>
         </w:tc>
@@ -5756,7 +5842,7 @@
               <w:rPr>
                 <w:sz w:val="17"/>
               </w:rPr>
-              <w:t>12.06</w:t>
+              <w:t>12.42</w:t>
             </w:r>
           </w:p>
         </w:tc>
@@ -5814,7 +5900,7 @@
               <w:rPr>
                 <w:sz w:val="17"/>
               </w:rPr>
-              <w:t>3.6600</w:t>
+              <w:t>3.8686</w:t>
             </w:r>
           </w:p>
         </w:tc>
@@ -5828,7 +5914,7 @@
               <w:rPr>
                 <w:sz w:val="17"/>
               </w:rPr>
-              <w:t>±0.460</w:t>
+              <w:t>±0.516</w:t>
             </w:r>
           </w:p>
         </w:tc>
@@ -5842,7 +5928,7 @@
               <w:rPr>
                 <w:sz w:val="17"/>
               </w:rPr>
-              <w:t>25.22</w:t>
+              <w:t>26.65</w:t>
             </w:r>
           </w:p>
         </w:tc>
@@ -5900,7 +5986,7 @@
               <w:rPr>
                 <w:sz w:val="17"/>
               </w:rPr>
-              <w:t>4.4077</w:t>
+              <w:t>4.3262</w:t>
             </w:r>
           </w:p>
         </w:tc>
@@ -5914,7 +6000,7 @@
               <w:rPr>
                 <w:sz w:val="17"/>
               </w:rPr>
-              <w:t>±0.420</w:t>
+              <w:t>±0.330</w:t>
             </w:r>
           </w:p>
         </w:tc>
@@ -5928,7 +6014,7 @@
               <w:rPr>
                 <w:sz w:val="17"/>
               </w:rPr>
-              <w:t>6.21</w:t>
+              <w:t>6.10</w:t>
             </w:r>
           </w:p>
         </w:tc>
@@ -5986,7 +6072,7 @@
               <w:rPr>
                 <w:sz w:val="17"/>
               </w:rPr>
-              <w:t>4.3160</w:t>
+              <w:t>4.3376</w:t>
             </w:r>
           </w:p>
         </w:tc>
@@ -6000,7 +6086,7 @@
               <w:rPr>
                 <w:sz w:val="17"/>
               </w:rPr>
-              <w:t>±0.282</w:t>
+              <w:t>±0.140</w:t>
             </w:r>
           </w:p>
         </w:tc>
@@ -6014,7 +6100,7 @@
               <w:rPr>
                 <w:sz w:val="17"/>
               </w:rPr>
-              <w:t>24.43</w:t>
+              <w:t>24.55</w:t>
             </w:r>
           </w:p>
         </w:tc>
@@ -6072,7 +6158,7 @@
               <w:rPr>
                 <w:sz w:val="17"/>
               </w:rPr>
-              <w:t>4.3313</w:t>
+              <w:t>4.4276</w:t>
             </w:r>
           </w:p>
         </w:tc>
@@ -6086,7 +6172,7 @@
               <w:rPr>
                 <w:sz w:val="17"/>
               </w:rPr>
-              <w:t>±0.296</w:t>
+              <w:t>±0.292</w:t>
             </w:r>
           </w:p>
         </w:tc>
@@ -6100,7 +6186,7 @@
               <w:rPr>
                 <w:sz w:val="17"/>
               </w:rPr>
-              <w:t>17.89</w:t>
+              <w:t>18.29</w:t>
             </w:r>
           </w:p>
         </w:tc>
@@ -6158,7 +6244,7 @@
               <w:rPr>
                 <w:sz w:val="17"/>
               </w:rPr>
-              <w:t>2.9781</w:t>
+              <w:t>2.9162</w:t>
             </w:r>
           </w:p>
         </w:tc>
@@ -6172,7 +6258,7 @@
               <w:rPr>
                 <w:sz w:val="17"/>
               </w:rPr>
-              <w:t>±0.202</w:t>
+              <w:t>±0.174</w:t>
             </w:r>
           </w:p>
         </w:tc>
@@ -6186,7 +6272,7 @@
               <w:rPr>
                 <w:sz w:val="17"/>
               </w:rPr>
-              <w:t>23.38</w:t>
+              <w:t>22.89</w:t>
             </w:r>
           </w:p>
         </w:tc>
@@ -6244,7 +6330,7 @@
               <w:rPr>
                 <w:sz w:val="17"/>
               </w:rPr>
-              <w:t>4.4681</w:t>
+              <w:t>4.4152</w:t>
             </w:r>
           </w:p>
         </w:tc>
@@ -6258,7 +6344,7 @@
               <w:rPr>
                 <w:sz w:val="17"/>
               </w:rPr>
-              <w:t>±0.240</w:t>
+              <w:t>±0.209</w:t>
             </w:r>
           </w:p>
         </w:tc>
@@ -6272,7 +6358,7 @@
               <w:rPr>
                 <w:sz w:val="17"/>
               </w:rPr>
-              <w:t>52.28</w:t>
+              <w:t>51.66</w:t>
             </w:r>
           </w:p>
         </w:tc>
@@ -6330,7 +6416,7 @@
               <w:rPr>
                 <w:sz w:val="17"/>
               </w:rPr>
-              <w:t>4.6877</w:t>
+              <w:t>4.5943</w:t>
             </w:r>
           </w:p>
         </w:tc>
@@ -6344,7 +6430,7 @@
               <w:rPr>
                 <w:sz w:val="17"/>
               </w:rPr>
-              <w:t>±0.343</w:t>
+              <w:t>±0.331</w:t>
             </w:r>
           </w:p>
         </w:tc>
@@ -6358,7 +6444,7 @@
               <w:rPr>
                 <w:sz w:val="17"/>
               </w:rPr>
-              <w:t>10.97</w:t>
+              <w:t>10.75</w:t>
             </w:r>
           </w:p>
         </w:tc>
@@ -6416,7 +6502,7 @@
               <w:rPr>
                 <w:sz w:val="17"/>
               </w:rPr>
-              <w:t>4.4114</w:t>
+              <w:t>4.3255</w:t>
             </w:r>
           </w:p>
         </w:tc>
@@ -6430,7 +6516,7 @@
               <w:rPr>
                 <w:sz w:val="17"/>
               </w:rPr>
-              <w:t>±0.287</w:t>
+              <w:t>±0.192</w:t>
             </w:r>
           </w:p>
         </w:tc>
@@ -6444,7 +6530,7 @@
               <w:rPr>
                 <w:sz w:val="17"/>
               </w:rPr>
-              <w:t>22.10</w:t>
+              <w:t>21.67</w:t>
             </w:r>
           </w:p>
         </w:tc>
@@ -6502,7 +6588,7 @@
               <w:rPr>
                 <w:sz w:val="17"/>
               </w:rPr>
-              <w:t>4.8012</w:t>
+              <w:t>4.9585</w:t>
             </w:r>
           </w:p>
         </w:tc>
@@ -6516,7 +6602,7 @@
               <w:rPr>
                 <w:sz w:val="17"/>
               </w:rPr>
-              <w:t>±0.271</w:t>
+              <w:t>±0.288</w:t>
             </w:r>
           </w:p>
         </w:tc>
@@ -6530,7 +6616,7 @@
               <w:rPr>
                 <w:sz w:val="17"/>
               </w:rPr>
-              <w:t>8.40</w:t>
+              <w:t>8.68</w:t>
             </w:r>
           </w:p>
         </w:tc>
@@ -6588,7 +6674,7 @@
               <w:rPr>
                 <w:sz w:val="17"/>
               </w:rPr>
-              <w:t>4.7003</w:t>
+              <w:t>4.9879</w:t>
             </w:r>
           </w:p>
         </w:tc>
@@ -6602,7 +6688,7 @@
               <w:rPr>
                 <w:sz w:val="17"/>
               </w:rPr>
-              <w:t>±0.331</w:t>
+              <w:t>±0.292</w:t>
             </w:r>
           </w:p>
         </w:tc>
@@ -6616,7 +6702,7 @@
               <w:rPr>
                 <w:sz w:val="17"/>
               </w:rPr>
-              <w:t>10.06</w:t>
+              <w:t>10.67</w:t>
             </w:r>
           </w:p>
         </w:tc>

</xml_diff>

<commit_message>
fix: harden ML pipeline and simulator parity
Co-authored-by: Copilot <223556219+Copilot@users.noreply.github.com>
</commit_message>
<xml_diff>
--- a/Documento_Tecnico_Agrotec_Amanteca_FIRA2026.docx
+++ b/Documento_Tecnico_Agrotec_Amanteca_FIRA2026.docx
@@ -78,7 +78,7 @@
         </w:rPr>
         <w:t>Equipo: Agrotec-Amanteca  |  197 Parcelas Analizadas (138 Entrenamiento · 59 Predicción Ciega)</w:t>
         <w:br/>
-        <w:t>Modelo Seleccionado: Ensemble Agrotec (Smart-Pearson + IDW) (5-Fold MAE: 0.3576 ± 0.0662 t/ha · 5-Fold RMSE: 0.4984 ± 0.1084 t/ha · R²: 0.6098)</w:t>
+        <w:t>Modelo Seleccionado: Ensemble Agrotec (Smart-Pearson + IDW) (5-Fold MAE: 0.3562 ± 0.0662 t/ha · 5-Fold RMSE: 0.4968 ± 0.1085 t/ha · R²: 0.6124)</w:t>
       </w:r>
     </w:p>
     <w:p>
@@ -549,7 +549,7 @@
               <w:rPr>
                 <w:sz w:val="17"/>
               </w:rPr>
-              <w:t>MAE = 0.3576 ± 0.0662 t/ha | RMSE = 0.4984 ± 0.1084 t/ha | R² = 0.6098 ± 0.1804</w:t>
+              <w:t>MAE = 0.3562 ± 0.0662 t/ha | RMSE = 0.4968 ± 0.1085 t/ha | R² = 0.6124 ± 0.1795</w:t>
             </w:r>
           </w:p>
         </w:tc>
@@ -592,7 +592,7 @@
               <w:rPr>
                 <w:sz w:val="17"/>
               </w:rPr>
-              <w:t>MAE = 0.3724 ± 0.0623 t/ha | RMSE = 0.5076 ± 0.1183 t/ha</w:t>
+              <w:t>MAE = 0.3720 ± 0.0624 t/ha | RMSE = 0.5073 ± 0.1180 t/ha</w:t>
             </w:r>
           </w:p>
         </w:tc>
@@ -678,7 +678,7 @@
               <w:rPr>
                 <w:sz w:val="17"/>
               </w:rPr>
-              <w:t>Cobertura empírica fuera de muestra: 81.2% (Semiancho medio ±0.564 t/ha) | 73.2% con error ≤ ±0.50 t/ha</w:t>
+              <w:t>Cobertura empírica fuera de muestra: 81.2% (Semiancho medio ±0.584 t/ha) | 72.5% con error ≤ ±0.50 t/ha</w:t>
             </w:r>
           </w:p>
         </w:tc>
@@ -721,7 +721,7 @@
               <w:rPr>
                 <w:sz w:val="17"/>
               </w:rPr>
-              <w:t>1,542.68 t en las 59 parcelas ciegas (media 3.948 ± 0.693 t/ha) | Inferencia 197 parcelas en 91.36 ms (1433.7 KB)</w:t>
+              <w:t>1,540.38 t en las 59 parcelas ciegas (media 3.940 ± 0.692 t/ha) | Inferencia 197 parcelas en 89.50 ms (1436.8 KB)</w:t>
             </w:r>
           </w:p>
         </w:tc>
@@ -818,7 +818,7 @@
         <w:t xml:space="preserve">Etapa 5 — Autocorrelación Geoespacial por Ponderación Inversa a la Distancia (IDW k=7) y Calibración Conformal: </w:t>
       </w:r>
       <w:r>
-        <w:t>Se incorporó la variable spatial_idw_yield, que calcula el rendimiento promedio ponderado por el inverso de la distancia (1 / d^1.5) de las k = 7 parcelas de entrenamiento más cercanas, excluyendo coincidencias exactas (d &lt;= 1e-8) para impedir fuga de datos. Adicionalmente, se calibró un Intervalo de Predicción Conformal al 80% sobre los residuos Out-Of-Fold escalados por la dispersión de los 4 sub-modelos (factor q80 = 3.5155), alcanzando una cobertura empírica fuera de muestra del 81.2%.</w:t>
+        <w:t>Se incorporó la variable spatial_idw_yield, que calcula el rendimiento promedio ponderado por el inverso de la distancia (1 / d^1.5) de las k = 7 parcelas de entrenamiento más cercanas, excluyendo coincidencias exactas (d &lt;= 1e-8) para impedir fuga de datos. Adicionalmente, se calibró un Intervalo de Predicción Conformal al 80% sobre los residuos Out-Of-Fold escalados por la dispersión de los 4 sub-modelos (factor q80 = 3.6257), alcanzando una cobertura empírica fuera de muestra del 81.2%.</w:t>
       </w:r>
     </w:p>
     <w:p>
@@ -907,7 +907,7 @@
         <w:t xml:space="preserve">1. Ensemble Agrotec (Voting Heterogéneo + Smart-Pearson + IDW) — [MODELO GANADOR SELECCIONADO]: </w:t>
       </w:r>
       <w:r>
-        <w:t>Integra cuatro familias algorítmicas complementarias mediante votación ponderada: Extra Trees Podado (40%), Random Forest Podado (25%), Support Vector Regressor con Kernel RBF y RobustScaler (20%), y Gradient Boosting Regressor (15%), operando sobre las 23 variables del filtro Leak-Free Smart-Pearson + IDW. ¿Por qué quedó seleccionado?: Obtuvo el menor error tanto en 5-Fold CV (MAE = 0.3576 ± 0.0662 t/ha, RMSE = 0.4984 ± 0.1084 t/ha, R² = 0.6098) como en 5×5 Repeated CV (RMSE = 0.5076 ± 0.1183 t/ha).</w:t>
+        <w:t>Integra cuatro familias algorítmicas complementarias mediante votación ponderada: Extra Trees Podado (40%), Random Forest Podado (25%), Support Vector Regressor con Kernel RBF y RobustScaler (20%), y Gradient Boosting Regressor (15%), operando sobre las 23 variables del filtro Leak-Free Smart-Pearson + IDW. ¿Por qué quedó seleccionado?: Obtuvo el menor error tanto en 5-Fold CV (MAE = 0.3562 ± 0.0662 t/ha, RMSE = 0.4968 ± 0.1085 t/ha, R² = 0.6124) como en 5×5 Repeated CV (RMSE = 0.5073 ± 0.1180 t/ha).</w:t>
       </w:r>
     </w:p>
     <w:p>
@@ -1300,7 +1300,7 @@
                 <w:b/>
                 <w:sz w:val="16"/>
               </w:rPr>
-              <w:t>0.3576 ± 0.066</w:t>
+              <w:t>0.3562 ± 0.066</w:t>
             </w:r>
           </w:p>
         </w:tc>
@@ -1321,7 +1321,7 @@
                 <w:b/>
                 <w:sz w:val="16"/>
               </w:rPr>
-              <w:t>0.4984 ± 0.108</w:t>
+              <w:t>0.4968 ± 0.108</w:t>
             </w:r>
           </w:p>
         </w:tc>
@@ -1342,7 +1342,7 @@
                 <w:b/>
                 <w:sz w:val="16"/>
               </w:rPr>
-              <w:t>0.6098</w:t>
+              <w:t>0.6124</w:t>
             </w:r>
           </w:p>
         </w:tc>
@@ -1363,7 +1363,7 @@
                 <w:b/>
                 <w:sz w:val="16"/>
               </w:rPr>
-              <w:t>0.5076 ± 0.118</w:t>
+              <w:t>0.5073 ± 0.118</w:t>
             </w:r>
           </w:p>
         </w:tc>
@@ -1384,7 +1384,7 @@
                 <w:b/>
                 <w:sz w:val="16"/>
               </w:rPr>
-              <w:t>4157 ms</w:t>
+              <w:t>3023 ms</w:t>
             </w:r>
           </w:p>
         </w:tc>
@@ -1406,7 +1406,7 @@
               <w:rPr>
                 <w:sz w:val="16"/>
               </w:rPr>
-              <w:t>Extra Trees (Smart-Pearson + IDW)</w:t>
+              <w:t>Ensemble Voting (Filtro Secuencial 39)</w:t>
             </w:r>
           </w:p>
         </w:tc>
@@ -1426,7 +1426,7 @@
               <w:rPr>
                 <w:sz w:val="16"/>
               </w:rPr>
-              <w:t>23 Smart-Pearson+IDW</w:t>
+              <w:t>39 base</w:t>
             </w:r>
           </w:p>
         </w:tc>
@@ -1446,7 +1446,7 @@
               <w:rPr>
                 <w:sz w:val="16"/>
               </w:rPr>
-              <w:t>0.3682 ± 0.061</w:t>
+              <w:t>0.3661 ± 0.063</w:t>
             </w:r>
           </w:p>
         </w:tc>
@@ -1466,7 +1466,7 @@
               <w:rPr>
                 <w:sz w:val="16"/>
               </w:rPr>
-              <w:t>0.5077 ± 0.095</w:t>
+              <w:t>0.5058 ± 0.097</w:t>
             </w:r>
           </w:p>
         </w:tc>
@@ -1486,7 +1486,7 @@
               <w:rPr>
                 <w:sz w:val="16"/>
               </w:rPr>
-              <w:t>0.5947</w:t>
+              <w:t>0.5999</w:t>
             </w:r>
           </w:p>
         </w:tc>
@@ -1506,7 +1506,7 @@
               <w:rPr>
                 <w:sz w:val="16"/>
               </w:rPr>
-              <w:t>0.5124 ± 0.111</w:t>
+              <w:t>0.5129 ± 0.112</w:t>
             </w:r>
           </w:p>
         </w:tc>
@@ -1526,7 +1526,7 @@
               <w:rPr>
                 <w:sz w:val="16"/>
               </w:rPr>
-              <w:t>1235 ms</w:t>
+              <w:t>2782 ms</w:t>
             </w:r>
           </w:p>
         </w:tc>
@@ -1548,7 +1548,7 @@
               <w:rPr>
                 <w:sz w:val="16"/>
               </w:rPr>
-              <w:t>Ensemble Voting (Filtro Secuencial 39)</w:t>
+              <w:t>Extra Trees (Smart-Pearson + IDW)</w:t>
             </w:r>
           </w:p>
         </w:tc>
@@ -1568,7 +1568,7 @@
               <w:rPr>
                 <w:sz w:val="16"/>
               </w:rPr>
-              <w:t>39 base</w:t>
+              <w:t>23 Smart-Pearson+IDW</w:t>
             </w:r>
           </w:p>
         </w:tc>
@@ -1588,7 +1588,7 @@
               <w:rPr>
                 <w:sz w:val="16"/>
               </w:rPr>
-              <w:t>0.3661 ± 0.063</w:t>
+              <w:t>0.3662 ± 0.061</w:t>
             </w:r>
           </w:p>
         </w:tc>
@@ -1608,7 +1608,7 @@
               <w:rPr>
                 <w:sz w:val="16"/>
               </w:rPr>
-              <w:t>0.5058 ± 0.097</w:t>
+              <w:t>0.5061 ± 0.095</w:t>
             </w:r>
           </w:p>
         </w:tc>
@@ -1628,7 +1628,7 @@
               <w:rPr>
                 <w:sz w:val="16"/>
               </w:rPr>
-              <w:t>0.5999</w:t>
+              <w:t>0.5974</w:t>
             </w:r>
           </w:p>
         </w:tc>
@@ -1648,7 +1648,7 @@
               <w:rPr>
                 <w:sz w:val="16"/>
               </w:rPr>
-              <w:t>0.5129 ± 0.112</w:t>
+              <w:t>0.5131 ± 0.111</w:t>
             </w:r>
           </w:p>
         </w:tc>
@@ -1668,7 +1668,7 @@
               <w:rPr>
                 <w:sz w:val="16"/>
               </w:rPr>
-              <w:t>2680 ms</w:t>
+              <w:t>1301 ms</w:t>
             </w:r>
           </w:p>
         </w:tc>
@@ -1810,7 +1810,7 @@
               <w:rPr>
                 <w:sz w:val="16"/>
               </w:rPr>
-              <w:t>345 ms</w:t>
+              <w:t>361 ms</w:t>
             </w:r>
           </w:p>
         </w:tc>
@@ -1952,7 +1952,7 @@
               <w:rPr>
                 <w:sz w:val="16"/>
               </w:rPr>
-              <w:t>1668 ms</w:t>
+              <w:t>1735 ms</w:t>
             </w:r>
           </w:p>
         </w:tc>
@@ -1974,7 +1974,7 @@
               <w:rPr>
                 <w:sz w:val="16"/>
               </w:rPr>
-              <w:t>Stacking Meta-Ensemble (Smart-Pearson + IDW)</w:t>
+              <w:t>RidgeCV Lineal Regularizado</w:t>
             </w:r>
           </w:p>
         </w:tc>
@@ -1994,7 +1994,7 @@
               <w:rPr>
                 <w:sz w:val="16"/>
               </w:rPr>
-              <w:t>23 Smart-Pearson+IDW</w:t>
+              <w:t>39 base</w:t>
             </w:r>
           </w:p>
         </w:tc>
@@ -2014,7 +2014,7 @@
               <w:rPr>
                 <w:sz w:val="16"/>
               </w:rPr>
-              <w:t>0.3606 ± 0.066</w:t>
+              <w:t>0.3819 ± 0.061</w:t>
             </w:r>
           </w:p>
         </w:tc>
@@ -2034,7 +2034,7 @@
               <w:rPr>
                 <w:sz w:val="16"/>
               </w:rPr>
-              <w:t>0.5006 ± 0.107</w:t>
+              <w:t>0.5180 ± 0.085</w:t>
             </w:r>
           </w:p>
         </w:tc>
@@ -2054,7 +2054,7 @@
               <w:rPr>
                 <w:sz w:val="16"/>
               </w:rPr>
-              <w:t>0.6095</w:t>
+              <w:t>0.5802</w:t>
             </w:r>
           </w:p>
         </w:tc>
@@ -2074,7 +2074,7 @@
               <w:rPr>
                 <w:sz w:val="16"/>
               </w:rPr>
-              <w:t>0.5186 ± 0.117</w:t>
+              <w:t>0.5201 ± 0.105</w:t>
             </w:r>
           </w:p>
         </w:tc>
@@ -2094,7 +2094,7 @@
               <w:rPr>
                 <w:sz w:val="16"/>
               </w:rPr>
-              <w:t>14697 ms</w:t>
+              <w:t>66 ms</w:t>
             </w:r>
           </w:p>
         </w:tc>
@@ -2116,7 +2116,7 @@
               <w:rPr>
                 <w:sz w:val="16"/>
               </w:rPr>
-              <w:t>RidgeCV Lineal Regularizado</w:t>
+              <w:t>Stacking Meta-Ensemble (Smart-Pearson + IDW)</w:t>
             </w:r>
           </w:p>
         </w:tc>
@@ -2136,7 +2136,7 @@
               <w:rPr>
                 <w:sz w:val="16"/>
               </w:rPr>
-              <w:t>39 base</w:t>
+              <w:t>23 Smart-Pearson+IDW</w:t>
             </w:r>
           </w:p>
         </w:tc>
@@ -2156,7 +2156,7 @@
               <w:rPr>
                 <w:sz w:val="16"/>
               </w:rPr>
-              <w:t>0.3819 ± 0.061</w:t>
+              <w:t>0.3617 ± 0.067</w:t>
             </w:r>
           </w:p>
         </w:tc>
@@ -2176,7 +2176,7 @@
               <w:rPr>
                 <w:sz w:val="16"/>
               </w:rPr>
-              <w:t>0.5180 ± 0.085</w:t>
+              <w:t>0.5047 ± 0.105</w:t>
             </w:r>
           </w:p>
         </w:tc>
@@ -2196,7 +2196,7 @@
               <w:rPr>
                 <w:sz w:val="16"/>
               </w:rPr>
-              <w:t>0.5802</w:t>
+              <w:t>0.6031</w:t>
             </w:r>
           </w:p>
         </w:tc>
@@ -2216,7 +2216,7 @@
               <w:rPr>
                 <w:sz w:val="16"/>
               </w:rPr>
-              <w:t>0.5201 ± 0.105</w:t>
+              <w:t>0.5219 ± 0.116</w:t>
             </w:r>
           </w:p>
         </w:tc>
@@ -2236,7 +2236,7 @@
               <w:rPr>
                 <w:sz w:val="16"/>
               </w:rPr>
-              <w:t>65 ms</w:t>
+              <w:t>15413 ms</w:t>
             </w:r>
           </w:p>
         </w:tc>
@@ -2378,7 +2378,7 @@
               <w:rPr>
                 <w:sz w:val="16"/>
               </w:rPr>
-              <w:t>992 ms</w:t>
+              <w:t>1042 ms</w:t>
             </w:r>
           </w:p>
         </w:tc>
@@ -2520,7 +2520,7 @@
               <w:rPr>
                 <w:sz w:val="16"/>
               </w:rPr>
-              <w:t>56 ms</w:t>
+              <w:t>61 ms</w:t>
             </w:r>
           </w:p>
         </w:tc>
@@ -2662,7 +2662,7 @@
               <w:rPr>
                 <w:sz w:val="16"/>
               </w:rPr>
-              <w:t>125 ms</w:t>
+              <w:t>106 ms</w:t>
             </w:r>
           </w:p>
         </w:tc>
@@ -2804,7 +2804,7 @@
               <w:rPr>
                 <w:sz w:val="16"/>
               </w:rPr>
-              <w:t>22 ms</w:t>
+              <w:t>16 ms</w:t>
             </w:r>
           </w:p>
         </w:tc>
@@ -2870,7 +2870,7 @@
           <w:i/>
           <w:sz w:val="18"/>
         </w:rPr>
-        <w:t>Figura 3. Auditoría Out-Of-Fold en las 138 parcelas de entrenamiento. El 73.2% de las parcelas se ubica dentro de ±0.50 t/ha y el intervalo conformal al 80% cubre el 81.2% de las observaciones reales.</w:t>
+        <w:t>Figura 3. Auditoría Out-Of-Fold en las 138 parcelas de entrenamiento. El 72.5% de las parcelas se ubica dentro de ±0.50 t/ha y el intervalo conformal al 80% cubre el 81.2% de las observaciones reales.</w:t>
       </w:r>
     </w:p>
     <w:p>
@@ -3301,7 +3301,7 @@
     </w:p>
     <w:p>
       <w:r>
-        <w:t>A continuación se presenta el padrón completo de las 59 parcelas ciegas pronosticadas por el modelo seleccionado (Ensemble Agrotec (Smart-Pearson + IDW)). El rendimiento medio estimado es de 3.948 ± 0.693 t/ha (rango de 2.71 a 5.00 t/ha), proyectando una cosecha total de 1,542.68 toneladas de cebada en las 393.57 hectáreas evaluadas, acompañado de su Intervalo de Predicción Conformal al 80%:</w:t>
+        <w:t>A continuación se presenta el padrón completo de las 59 parcelas ciegas pronosticadas por el modelo seleccionado (Ensemble Agrotec (Smart-Pearson + IDW)). El rendimiento medio estimado es de 3.940 ± 0.692 t/ha (rango de 2.70 a 4.99 t/ha), proyectando una cosecha total de 1,540.38 toneladas de cebada en las 393.57 hectáreas evaluadas, acompañado de su Intervalo de Predicción Conformal al 80%:</w:t>
       </w:r>
     </w:p>
     <w:tbl>
@@ -3531,7 +3531,7 @@
                 <w:b/>
                 <w:sz w:val="17"/>
               </w:rPr>
-              <w:t>3.4014</w:t>
+              <w:t>3.4092</w:t>
             </w:r>
           </w:p>
         </w:tc>
@@ -3551,7 +3551,7 @@
               <w:rPr>
                 <w:sz w:val="17"/>
               </w:rPr>
-              <w:t>[2.53 – 4.27] (±0.87)</w:t>
+              <w:t>[2.50 – 4.32] (±0.91)</w:t>
             </w:r>
           </w:p>
         </w:tc>
@@ -3571,7 +3571,7 @@
               <w:rPr>
                 <w:sz w:val="17"/>
               </w:rPr>
-              <w:t>63.54</w:t>
+              <w:t>63.68</w:t>
             </w:r>
           </w:p>
         </w:tc>
@@ -3655,7 +3655,7 @@
                 <w:b/>
                 <w:sz w:val="17"/>
               </w:rPr>
-              <w:t>4.5674</w:t>
+              <w:t>4.5543</w:t>
             </w:r>
           </w:p>
         </w:tc>
@@ -3675,7 +3675,7 @@
               <w:rPr>
                 <w:sz w:val="17"/>
               </w:rPr>
-              <w:t>[3.96 – 5.17] (±0.61)</w:t>
+              <w:t>[3.90 – 5.21] (±0.66)</w:t>
             </w:r>
           </w:p>
         </w:tc>
@@ -3695,7 +3695,7 @@
               <w:rPr>
                 <w:sz w:val="17"/>
               </w:rPr>
-              <w:t>32.75</w:t>
+              <w:t>32.65</w:t>
             </w:r>
           </w:p>
         </w:tc>
@@ -3779,7 +3779,7 @@
                 <w:b/>
                 <w:sz w:val="17"/>
               </w:rPr>
-              <w:t>4.3398</w:t>
+              <w:t>4.3300</w:t>
             </w:r>
           </w:p>
         </w:tc>
@@ -3799,7 +3799,7 @@
               <w:rPr>
                 <w:sz w:val="17"/>
               </w:rPr>
-              <w:t>[3.81 – 4.87] (±0.53)</w:t>
+              <w:t>[3.79 – 4.87] (±0.54)</w:t>
             </w:r>
           </w:p>
         </w:tc>
@@ -3819,7 +3819,7 @@
               <w:rPr>
                 <w:sz w:val="17"/>
               </w:rPr>
-              <w:t>32.42</w:t>
+              <w:t>32.35</w:t>
             </w:r>
           </w:p>
         </w:tc>
@@ -3903,7 +3903,7 @@
                 <w:b/>
                 <w:sz w:val="17"/>
               </w:rPr>
-              <w:t>2.9410</w:t>
+              <w:t>2.9403</w:t>
             </w:r>
           </w:p>
         </w:tc>
@@ -3923,7 +3923,7 @@
               <w:rPr>
                 <w:sz w:val="17"/>
               </w:rPr>
-              <w:t>[2.41 – 3.47] (±0.53)</w:t>
+              <w:t>[2.40 – 3.48] (±0.54)</w:t>
             </w:r>
           </w:p>
         </w:tc>
@@ -4027,7 +4027,7 @@
                 <w:b/>
                 <w:sz w:val="17"/>
               </w:rPr>
-              <w:t>3.2151</w:t>
+              <w:t>3.2125</w:t>
             </w:r>
           </w:p>
         </w:tc>
@@ -4047,7 +4047,7 @@
               <w:rPr>
                 <w:sz w:val="17"/>
               </w:rPr>
-              <w:t>[2.69 – 3.74] (±0.53)</w:t>
+              <w:t>[2.67 – 3.76] (±0.54)</w:t>
             </w:r>
           </w:p>
         </w:tc>
@@ -4067,7 +4067,7 @@
               <w:rPr>
                 <w:sz w:val="17"/>
               </w:rPr>
-              <w:t>27.20</w:t>
+              <w:t>27.18</w:t>
             </w:r>
           </w:p>
         </w:tc>
@@ -4151,7 +4151,7 @@
                 <w:b/>
                 <w:sz w:val="17"/>
               </w:rPr>
-              <w:t>4.6272</w:t>
+              <w:t>4.6254</w:t>
             </w:r>
           </w:p>
         </w:tc>
@@ -4171,7 +4171,7 @@
               <w:rPr>
                 <w:sz w:val="17"/>
               </w:rPr>
-              <w:t>[4.10 – 5.15] (±0.53)</w:t>
+              <w:t>[4.08 – 5.17] (±0.54)</w:t>
             </w:r>
           </w:p>
         </w:tc>
@@ -4191,7 +4191,7 @@
               <w:rPr>
                 <w:sz w:val="17"/>
               </w:rPr>
-              <w:t>8.61</w:t>
+              <w:t>8.60</w:t>
             </w:r>
           </w:p>
         </w:tc>
@@ -4275,7 +4275,7 @@
                 <w:b/>
                 <w:sz w:val="17"/>
               </w:rPr>
-              <w:t>3.1899</w:t>
+              <w:t>3.1847</w:t>
             </w:r>
           </w:p>
         </w:tc>
@@ -4295,7 +4295,7 @@
               <w:rPr>
                 <w:sz w:val="17"/>
               </w:rPr>
-              <w:t>[1.76 – 4.62] (±1.43)</w:t>
+              <w:t>[1.71 – 4.66] (±1.48)</w:t>
             </w:r>
           </w:p>
         </w:tc>
@@ -4315,7 +4315,7 @@
               <w:rPr>
                 <w:sz w:val="17"/>
               </w:rPr>
-              <w:t>18.82</w:t>
+              <w:t>18.79</w:t>
             </w:r>
           </w:p>
         </w:tc>
@@ -4399,7 +4399,7 @@
                 <w:b/>
                 <w:sz w:val="17"/>
               </w:rPr>
-              <w:t>3.2550</w:t>
+              <w:t>3.2592</w:t>
             </w:r>
           </w:p>
         </w:tc>
@@ -4419,7 +4419,7 @@
               <w:rPr>
                 <w:sz w:val="17"/>
               </w:rPr>
-              <w:t>[2.73 – 3.78] (±0.53)</w:t>
+              <w:t>[2.72 – 3.80] (±0.54)</w:t>
             </w:r>
           </w:p>
         </w:tc>
@@ -4439,7 +4439,7 @@
               <w:rPr>
                 <w:sz w:val="17"/>
               </w:rPr>
-              <w:t>42.48</w:t>
+              <w:t>42.53</w:t>
             </w:r>
           </w:p>
         </w:tc>
@@ -4523,7 +4523,7 @@
                 <w:b/>
                 <w:sz w:val="17"/>
               </w:rPr>
-              <w:t>4.3572</w:t>
+              <w:t>4.3845</w:t>
             </w:r>
           </w:p>
         </w:tc>
@@ -4543,7 +4543,7 @@
               <w:rPr>
                 <w:sz w:val="17"/>
               </w:rPr>
-              <w:t>[3.81 – 4.91] (±0.55)</w:t>
+              <w:t>[3.84 – 4.93] (±0.54)</w:t>
             </w:r>
           </w:p>
         </w:tc>
@@ -4563,7 +4563,7 @@
               <w:rPr>
                 <w:sz w:val="17"/>
               </w:rPr>
-              <w:t>8.63</w:t>
+              <w:t>8.68</w:t>
             </w:r>
           </w:p>
         </w:tc>
@@ -4647,7 +4647,7 @@
                 <w:b/>
                 <w:sz w:val="17"/>
               </w:rPr>
-              <w:t>4.2844</w:t>
+              <w:t>4.2887</w:t>
             </w:r>
           </w:p>
         </w:tc>
@@ -4667,7 +4667,7 @@
               <w:rPr>
                 <w:sz w:val="17"/>
               </w:rPr>
-              <w:t>[3.76 – 4.81] (±0.53)</w:t>
+              <w:t>[3.74 – 4.83] (±0.54)</w:t>
             </w:r>
           </w:p>
         </w:tc>
@@ -4687,7 +4687,7 @@
               <w:rPr>
                 <w:sz w:val="17"/>
               </w:rPr>
-              <w:t>21.42</w:t>
+              <w:t>21.44</w:t>
             </w:r>
           </w:p>
         </w:tc>
@@ -4771,7 +4771,7 @@
                 <w:b/>
                 <w:sz w:val="17"/>
               </w:rPr>
-              <w:t>2.9263</w:t>
+              <w:t>2.9165</w:t>
             </w:r>
           </w:p>
         </w:tc>
@@ -4791,7 +4791,7 @@
               <w:rPr>
                 <w:sz w:val="17"/>
               </w:rPr>
-              <w:t>[2.40 – 3.45] (±0.53)</w:t>
+              <w:t>[2.37 – 3.46] (±0.54)</w:t>
             </w:r>
           </w:p>
         </w:tc>
@@ -4811,7 +4811,7 @@
               <w:rPr>
                 <w:sz w:val="17"/>
               </w:rPr>
-              <w:t>22.56</w:t>
+              <w:t>22.49</w:t>
             </w:r>
           </w:p>
         </w:tc>
@@ -4895,7 +4895,7 @@
                 <w:b/>
                 <w:sz w:val="17"/>
               </w:rPr>
-              <w:t>3.0667</w:t>
+              <w:t>3.0632</w:t>
             </w:r>
           </w:p>
         </w:tc>
@@ -4915,7 +4915,7 @@
               <w:rPr>
                 <w:sz w:val="17"/>
               </w:rPr>
-              <w:t>[2.54 – 3.59] (±0.53)</w:t>
+              <w:t>[2.52 – 3.61] (±0.54)</w:t>
             </w:r>
           </w:p>
         </w:tc>
@@ -4935,7 +4935,7 @@
               <w:rPr>
                 <w:sz w:val="17"/>
               </w:rPr>
-              <w:t>11.68</w:t>
+              <w:t>11.67</w:t>
             </w:r>
           </w:p>
         </w:tc>
@@ -5019,7 +5019,7 @@
                 <w:b/>
                 <w:sz w:val="17"/>
               </w:rPr>
-              <w:t>4.4949</w:t>
+              <w:t>4.4892</w:t>
             </w:r>
           </w:p>
         </w:tc>
@@ -5039,7 +5039,7 @@
               <w:rPr>
                 <w:sz w:val="17"/>
               </w:rPr>
-              <w:t>[3.97 – 5.02] (±0.53)</w:t>
+              <w:t>[3.95 – 5.03] (±0.54)</w:t>
             </w:r>
           </w:p>
         </w:tc>
@@ -5059,7 +5059,7 @@
               <w:rPr>
                 <w:sz w:val="17"/>
               </w:rPr>
-              <w:t>32.14</w:t>
+              <w:t>32.10</w:t>
             </w:r>
           </w:p>
         </w:tc>
@@ -5143,7 +5143,7 @@
                 <w:b/>
                 <w:sz w:val="17"/>
               </w:rPr>
-              <w:t>2.9912</w:t>
+              <w:t>2.9865</w:t>
             </w:r>
           </w:p>
         </w:tc>
@@ -5163,7 +5163,7 @@
               <w:rPr>
                 <w:sz w:val="17"/>
               </w:rPr>
-              <w:t>[2.46 – 3.52] (±0.53)</w:t>
+              <w:t>[2.44 – 3.53] (±0.54)</w:t>
             </w:r>
           </w:p>
         </w:tc>
@@ -5183,7 +5183,7 @@
               <w:rPr>
                 <w:sz w:val="17"/>
               </w:rPr>
-              <w:t>7.24</w:t>
+              <w:t>7.23</w:t>
             </w:r>
           </w:p>
         </w:tc>
@@ -5267,7 +5267,7 @@
                 <w:b/>
                 <w:sz w:val="17"/>
               </w:rPr>
-              <w:t>4.4228</w:t>
+              <w:t>4.4068</w:t>
             </w:r>
           </w:p>
         </w:tc>
@@ -5287,7 +5287,7 @@
               <w:rPr>
                 <w:sz w:val="17"/>
               </w:rPr>
-              <w:t>[3.90 – 4.95] (±0.53)</w:t>
+              <w:t>[3.86 – 4.95] (±0.54)</w:t>
             </w:r>
           </w:p>
         </w:tc>
@@ -5307,7 +5307,7 @@
               <w:rPr>
                 <w:sz w:val="17"/>
               </w:rPr>
-              <w:t>27.55</w:t>
+              <w:t>27.45</w:t>
             </w:r>
           </w:p>
         </w:tc>
@@ -5391,7 +5391,7 @@
                 <w:b/>
                 <w:sz w:val="17"/>
               </w:rPr>
-              <w:t>3.0270</w:t>
+              <w:t>3.0100</w:t>
             </w:r>
           </w:p>
         </w:tc>
@@ -5411,7 +5411,7 @@
               <w:rPr>
                 <w:sz w:val="17"/>
               </w:rPr>
-              <w:t>[2.50 – 3.55] (±0.53)</w:t>
+              <w:t>[2.47 – 3.55] (±0.54)</w:t>
             </w:r>
           </w:p>
         </w:tc>
@@ -5431,7 +5431,7 @@
               <w:rPr>
                 <w:sz w:val="17"/>
               </w:rPr>
-              <w:t>21.89</w:t>
+              <w:t>21.76</w:t>
             </w:r>
           </w:p>
         </w:tc>
@@ -5515,7 +5515,7 @@
                 <w:b/>
                 <w:sz w:val="17"/>
               </w:rPr>
-              <w:t>4.4125</w:t>
+              <w:t>4.4061</w:t>
             </w:r>
           </w:p>
         </w:tc>
@@ -5535,7 +5535,7 @@
               <w:rPr>
                 <w:sz w:val="17"/>
               </w:rPr>
-              <w:t>[3.89 – 4.94] (±0.53)</w:t>
+              <w:t>[3.86 – 4.95] (±0.54)</w:t>
             </w:r>
           </w:p>
         </w:tc>
@@ -5555,7 +5555,7 @@
               <w:rPr>
                 <w:sz w:val="17"/>
               </w:rPr>
-              <w:t>55.33</w:t>
+              <w:t>55.25</w:t>
             </w:r>
           </w:p>
         </w:tc>
@@ -5639,7 +5639,7 @@
                 <w:b/>
                 <w:sz w:val="17"/>
               </w:rPr>
-              <w:t>4.3961</w:t>
+              <w:t>4.4006</w:t>
             </w:r>
           </w:p>
         </w:tc>
@@ -5659,7 +5659,7 @@
               <w:rPr>
                 <w:sz w:val="17"/>
               </w:rPr>
-              <w:t>[3.87 – 4.92] (±0.53)</w:t>
+              <w:t>[3.86 – 4.94] (±0.54)</w:t>
             </w:r>
           </w:p>
         </w:tc>
@@ -5679,7 +5679,7 @@
               <w:rPr>
                 <w:sz w:val="17"/>
               </w:rPr>
-              <w:t>267.63</w:t>
+              <w:t>267.91</w:t>
             </w:r>
           </w:p>
         </w:tc>
@@ -5763,7 +5763,7 @@
                 <w:b/>
                 <w:sz w:val="17"/>
               </w:rPr>
-              <w:t>3.0301</w:t>
+              <w:t>3.0317</w:t>
             </w:r>
           </w:p>
         </w:tc>
@@ -5783,7 +5783,7 @@
               <w:rPr>
                 <w:sz w:val="17"/>
               </w:rPr>
-              <w:t>[2.50 – 3.56] (±0.53)</w:t>
+              <w:t>[2.49 – 3.58] (±0.54)</w:t>
             </w:r>
           </w:p>
         </w:tc>
@@ -5803,7 +5803,7 @@
               <w:rPr>
                 <w:sz w:val="17"/>
               </w:rPr>
-              <w:t>15.79</w:t>
+              <w:t>15.80</w:t>
             </w:r>
           </w:p>
         </w:tc>
@@ -5887,7 +5887,7 @@
                 <w:b/>
                 <w:sz w:val="17"/>
               </w:rPr>
-              <w:t>3.0170</w:t>
+              <w:t>3.0177</w:t>
             </w:r>
           </w:p>
         </w:tc>
@@ -5907,7 +5907,7 @@
               <w:rPr>
                 <w:sz w:val="17"/>
               </w:rPr>
-              <w:t>[2.49 – 3.54] (±0.53)</w:t>
+              <w:t>[2.47 – 3.56] (±0.54)</w:t>
             </w:r>
           </w:p>
         </w:tc>
@@ -6011,7 +6011,7 @@
                 <w:b/>
                 <w:sz w:val="17"/>
               </w:rPr>
-              <w:t>4.5622</w:t>
+              <w:t>4.5541</w:t>
             </w:r>
           </w:p>
         </w:tc>
@@ -6031,7 +6031,7 @@
               <w:rPr>
                 <w:sz w:val="17"/>
               </w:rPr>
-              <w:t>[4.03 – 5.09] (±0.53)</w:t>
+              <w:t>[4.01 – 5.10] (±0.54)</w:t>
             </w:r>
           </w:p>
         </w:tc>
@@ -6051,7 +6051,7 @@
               <w:rPr>
                 <w:sz w:val="17"/>
               </w:rPr>
-              <w:t>4.61</w:t>
+              <w:t>4.60</w:t>
             </w:r>
           </w:p>
         </w:tc>
@@ -6135,7 +6135,7 @@
                 <w:b/>
                 <w:sz w:val="17"/>
               </w:rPr>
-              <w:t>4.4323</w:t>
+              <w:t>4.4259</w:t>
             </w:r>
           </w:p>
         </w:tc>
@@ -6155,7 +6155,7 @@
               <w:rPr>
                 <w:sz w:val="17"/>
               </w:rPr>
-              <w:t>[3.90 – 4.96] (±0.53)</w:t>
+              <w:t>[3.88 – 4.97] (±0.54)</w:t>
             </w:r>
           </w:p>
         </w:tc>
@@ -6175,7 +6175,7 @@
               <w:rPr>
                 <w:sz w:val="17"/>
               </w:rPr>
-              <w:t>12.28</w:t>
+              <w:t>12.26</w:t>
             </w:r>
           </w:p>
         </w:tc>
@@ -6259,7 +6259,7 @@
                 <w:b/>
                 <w:sz w:val="17"/>
               </w:rPr>
-              <w:t>4.1410</w:t>
+              <w:t>3.9041</w:t>
             </w:r>
           </w:p>
         </w:tc>
@@ -6279,7 +6279,7 @@
               <w:rPr>
                 <w:sz w:val="17"/>
               </w:rPr>
-              <w:t>[3.61 – 4.67] (±0.53)</w:t>
+              <w:t>[2.87 – 4.93] (±1.03)</w:t>
             </w:r>
           </w:p>
         </w:tc>
@@ -6299,7 +6299,7 @@
               <w:rPr>
                 <w:sz w:val="17"/>
               </w:rPr>
-              <w:t>22.78</w:t>
+              <w:t>21.47</w:t>
             </w:r>
           </w:p>
         </w:tc>
@@ -6383,7 +6383,7 @@
                 <w:b/>
                 <w:sz w:val="17"/>
               </w:rPr>
-              <w:t>2.9466</w:t>
+              <w:t>2.9456</w:t>
             </w:r>
           </w:p>
         </w:tc>
@@ -6403,7 +6403,7 @@
               <w:rPr>
                 <w:sz w:val="17"/>
               </w:rPr>
-              <w:t>[2.42 – 3.47] (±0.53)</w:t>
+              <w:t>[2.40 – 3.49] (±0.54)</w:t>
             </w:r>
           </w:p>
         </w:tc>
@@ -6423,7 +6423,7 @@
               <w:rPr>
                 <w:sz w:val="17"/>
               </w:rPr>
-              <w:t>13.94</w:t>
+              <w:t>13.93</w:t>
             </w:r>
           </w:p>
         </w:tc>
@@ -6507,7 +6507,7 @@
                 <w:b/>
                 <w:sz w:val="17"/>
               </w:rPr>
-              <w:t>2.7097</w:t>
+              <w:t>2.7039</w:t>
             </w:r>
           </w:p>
         </w:tc>
@@ -6527,7 +6527,7 @@
               <w:rPr>
                 <w:sz w:val="17"/>
               </w:rPr>
-              <w:t>[2.18 – 3.24] (±0.53)</w:t>
+              <w:t>[2.16 – 3.25] (±0.54)</w:t>
             </w:r>
           </w:p>
         </w:tc>
@@ -6547,7 +6547,7 @@
               <w:rPr>
                 <w:sz w:val="17"/>
               </w:rPr>
-              <w:t>15.34</w:t>
+              <w:t>15.30</w:t>
             </w:r>
           </w:p>
         </w:tc>
@@ -6631,7 +6631,7 @@
                 <w:b/>
                 <w:sz w:val="17"/>
               </w:rPr>
-              <w:t>4.3687</w:t>
+              <w:t>4.3724</w:t>
             </w:r>
           </w:p>
         </w:tc>
@@ -6651,7 +6651,7 @@
               <w:rPr>
                 <w:sz w:val="17"/>
               </w:rPr>
-              <w:t>[3.84 – 4.90] (±0.53)</w:t>
+              <w:t>[3.83 – 4.92] (±0.54)</w:t>
             </w:r>
           </w:p>
         </w:tc>
@@ -6671,7 +6671,7 @@
               <w:rPr>
                 <w:sz w:val="17"/>
               </w:rPr>
-              <w:t>25.82</w:t>
+              <w:t>25.84</w:t>
             </w:r>
           </w:p>
         </w:tc>
@@ -6755,7 +6755,7 @@
                 <w:b/>
                 <w:sz w:val="17"/>
               </w:rPr>
-              <w:t>4.6957</w:t>
+              <w:t>4.6763</w:t>
             </w:r>
           </w:p>
         </w:tc>
@@ -6775,7 +6775,7 @@
               <w:rPr>
                 <w:sz w:val="17"/>
               </w:rPr>
-              <w:t>[4.17 – 5.22] (±0.53)</w:t>
+              <w:t>[4.13 – 5.22] (±0.54)</w:t>
             </w:r>
           </w:p>
         </w:tc>
@@ -6879,7 +6879,7 @@
                 <w:b/>
                 <w:sz w:val="17"/>
               </w:rPr>
-              <w:t>3.0702</w:t>
+              <w:t>3.0785</w:t>
             </w:r>
           </w:p>
         </w:tc>
@@ -6899,7 +6899,7 @@
               <w:rPr>
                 <w:sz w:val="17"/>
               </w:rPr>
-              <w:t>[2.54 – 3.60] (±0.53)</w:t>
+              <w:t>[2.53 – 3.62] (±0.54)</w:t>
             </w:r>
           </w:p>
         </w:tc>
@@ -6919,7 +6919,7 @@
               <w:rPr>
                 <w:sz w:val="17"/>
               </w:rPr>
-              <w:t>11.39</w:t>
+              <w:t>11.42</w:t>
             </w:r>
           </w:p>
         </w:tc>
@@ -7003,7 +7003,7 @@
                 <w:b/>
                 <w:sz w:val="17"/>
               </w:rPr>
-              <w:t>4.6731</w:t>
+              <w:t>4.6595</w:t>
             </w:r>
           </w:p>
         </w:tc>
@@ -7023,7 +7023,7 @@
               <w:rPr>
                 <w:sz w:val="17"/>
               </w:rPr>
-              <w:t>[4.15 – 5.20] (±0.53)</w:t>
+              <w:t>[4.12 – 5.20] (±0.54)</w:t>
             </w:r>
           </w:p>
         </w:tc>
@@ -7043,7 +7043,7 @@
               <w:rPr>
                 <w:sz w:val="17"/>
               </w:rPr>
-              <w:t>16.96</w:t>
+              <w:t>16.91</w:t>
             </w:r>
           </w:p>
         </w:tc>
@@ -7127,7 +7127,7 @@
                 <w:b/>
                 <w:sz w:val="17"/>
               </w:rPr>
-              <w:t>4.5210</w:t>
+              <w:t>4.5230</w:t>
             </w:r>
           </w:p>
         </w:tc>
@@ -7147,7 +7147,7 @@
               <w:rPr>
                 <w:sz w:val="17"/>
               </w:rPr>
-              <w:t>[3.99 – 5.05] (±0.53)</w:t>
+              <w:t>[3.98 – 5.07] (±0.54)</w:t>
             </w:r>
           </w:p>
         </w:tc>
@@ -7167,7 +7167,7 @@
               <w:rPr>
                 <w:sz w:val="17"/>
               </w:rPr>
-              <w:t>6.01</w:t>
+              <w:t>6.02</w:t>
             </w:r>
           </w:p>
         </w:tc>
@@ -7251,7 +7251,7 @@
                 <w:b/>
                 <w:sz w:val="17"/>
               </w:rPr>
-              <w:t>4.5391</w:t>
+              <w:t>4.5277</w:t>
             </w:r>
           </w:p>
         </w:tc>
@@ -7271,7 +7271,7 @@
               <w:rPr>
                 <w:sz w:val="17"/>
               </w:rPr>
-              <w:t>[4.01 – 5.07] (±0.53)</w:t>
+              <w:t>[3.98 – 5.07] (±0.54)</w:t>
             </w:r>
           </w:p>
         </w:tc>
@@ -7291,7 +7291,7 @@
               <w:rPr>
                 <w:sz w:val="17"/>
               </w:rPr>
-              <w:t>11.94</w:t>
+              <w:t>11.91</w:t>
             </w:r>
           </w:p>
         </w:tc>
@@ -7375,7 +7375,7 @@
                 <w:b/>
                 <w:sz w:val="17"/>
               </w:rPr>
-              <w:t>3.0590</w:t>
+              <w:t>3.0503</w:t>
             </w:r>
           </w:p>
         </w:tc>
@@ -7395,7 +7395,7 @@
               <w:rPr>
                 <w:sz w:val="17"/>
               </w:rPr>
-              <w:t>[2.48 – 3.64] (±0.58)</w:t>
+              <w:t>[2.45 – 3.65] (±0.60)</w:t>
             </w:r>
           </w:p>
         </w:tc>
@@ -7415,7 +7415,7 @@
               <w:rPr>
                 <w:sz w:val="17"/>
               </w:rPr>
-              <w:t>32.36</w:t>
+              <w:t>32.27</w:t>
             </w:r>
           </w:p>
         </w:tc>
@@ -7499,7 +7499,7 @@
                 <w:b/>
                 <w:sz w:val="17"/>
               </w:rPr>
-              <w:t>4.3485</w:t>
+              <w:t>4.3521</w:t>
             </w:r>
           </w:p>
         </w:tc>
@@ -7519,7 +7519,7 @@
               <w:rPr>
                 <w:sz w:val="17"/>
               </w:rPr>
-              <w:t>[3.82 – 4.88] (±0.53)</w:t>
+              <w:t>[3.81 – 4.90] (±0.54)</w:t>
             </w:r>
           </w:p>
         </w:tc>
@@ -7539,7 +7539,7 @@
               <w:rPr>
                 <w:sz w:val="17"/>
               </w:rPr>
-              <w:t>32.31</w:t>
+              <w:t>32.34</w:t>
             </w:r>
           </w:p>
         </w:tc>
@@ -7623,7 +7623,7 @@
                 <w:b/>
                 <w:sz w:val="17"/>
               </w:rPr>
-              <w:t>3.1108</w:t>
+              <w:t>3.1135</w:t>
             </w:r>
           </w:p>
         </w:tc>
@@ -7643,7 +7643,7 @@
               <w:rPr>
                 <w:sz w:val="17"/>
               </w:rPr>
-              <w:t>[2.58 – 3.64] (±0.53)</w:t>
+              <w:t>[2.57 – 3.66] (±0.54)</w:t>
             </w:r>
           </w:p>
         </w:tc>
@@ -7663,7 +7663,7 @@
               <w:rPr>
                 <w:sz w:val="17"/>
               </w:rPr>
-              <w:t>13.75</w:t>
+              <w:t>13.76</w:t>
             </w:r>
           </w:p>
         </w:tc>
@@ -7747,7 +7747,7 @@
                 <w:b/>
                 <w:sz w:val="17"/>
               </w:rPr>
-              <w:t>3.3074</w:t>
+              <w:t>3.2973</w:t>
             </w:r>
           </w:p>
         </w:tc>
@@ -7767,7 +7767,7 @@
               <w:rPr>
                 <w:sz w:val="17"/>
               </w:rPr>
-              <w:t>[2.69 – 3.93] (±0.62)</w:t>
+              <w:t>[2.62 – 3.97] (±0.67)</w:t>
             </w:r>
           </w:p>
         </w:tc>
@@ -7787,7 +7787,7 @@
               <w:rPr>
                 <w:sz w:val="17"/>
               </w:rPr>
-              <w:t>24.71</w:t>
+              <w:t>24.63</w:t>
             </w:r>
           </w:p>
         </w:tc>
@@ -7871,7 +7871,7 @@
                 <w:b/>
                 <w:sz w:val="17"/>
               </w:rPr>
-              <w:t>4.3370</w:t>
+              <w:t>4.3411</w:t>
             </w:r>
           </w:p>
         </w:tc>
@@ -7891,7 +7891,7 @@
               <w:rPr>
                 <w:sz w:val="17"/>
               </w:rPr>
-              <w:t>[3.81 – 4.86] (±0.53)</w:t>
+              <w:t>[3.80 – 4.88] (±0.54)</w:t>
             </w:r>
           </w:p>
         </w:tc>
@@ -7911,7 +7911,7 @@
               <w:rPr>
                 <w:sz w:val="17"/>
               </w:rPr>
-              <w:t>24.94</w:t>
+              <w:t>24.96</w:t>
             </w:r>
           </w:p>
         </w:tc>
@@ -7995,7 +7995,7 @@
                 <w:b/>
                 <w:sz w:val="17"/>
               </w:rPr>
-              <w:t>4.3615</w:t>
+              <w:t>4.3601</w:t>
             </w:r>
           </w:p>
         </w:tc>
@@ -8015,7 +8015,7 @@
               <w:rPr>
                 <w:sz w:val="17"/>
               </w:rPr>
-              <w:t>[3.83 – 4.89] (±0.53)</w:t>
+              <w:t>[3.82 – 4.90] (±0.54)</w:t>
             </w:r>
           </w:p>
         </w:tc>
@@ -8035,7 +8035,7 @@
               <w:rPr>
                 <w:sz w:val="17"/>
               </w:rPr>
-              <w:t>26.82</w:t>
+              <w:t>26.81</w:t>
             </w:r>
           </w:p>
         </w:tc>
@@ -8119,7 +8119,7 @@
                 <w:b/>
                 <w:sz w:val="17"/>
               </w:rPr>
-              <w:t>3.3105</w:t>
+              <w:t>3.3103</w:t>
             </w:r>
           </w:p>
         </w:tc>
@@ -8139,7 +8139,7 @@
               <w:rPr>
                 <w:sz w:val="17"/>
               </w:rPr>
-              <w:t>[2.39 – 4.23] (±0.92)</w:t>
+              <w:t>[2.35 – 4.27] (±0.96)</w:t>
             </w:r>
           </w:p>
         </w:tc>
@@ -8243,7 +8243,7 @@
                 <w:b/>
                 <w:sz w:val="17"/>
               </w:rPr>
-              <w:t>4.3245</w:t>
+              <w:t>4.3110</w:t>
             </w:r>
           </w:p>
         </w:tc>
@@ -8263,7 +8263,7 @@
               <w:rPr>
                 <w:sz w:val="17"/>
               </w:rPr>
-              <w:t>[3.80 – 4.85] (±0.53)</w:t>
+              <w:t>[3.77 – 4.85] (±0.54)</w:t>
             </w:r>
           </w:p>
         </w:tc>
@@ -8283,7 +8283,7 @@
               <w:rPr>
                 <w:sz w:val="17"/>
               </w:rPr>
-              <w:t>52.33</w:t>
+              <w:t>52.16</w:t>
             </w:r>
           </w:p>
         </w:tc>
@@ -8367,7 +8367,7 @@
                 <w:b/>
                 <w:sz w:val="17"/>
               </w:rPr>
-              <w:t>4.2384</w:t>
+              <w:t>4.2397</w:t>
             </w:r>
           </w:p>
         </w:tc>
@@ -8387,7 +8387,7 @@
               <w:rPr>
                 <w:sz w:val="17"/>
               </w:rPr>
-              <w:t>[3.71 – 4.77] (±0.53)</w:t>
+              <w:t>[3.70 – 4.78] (±0.54)</w:t>
             </w:r>
           </w:p>
         </w:tc>
@@ -8407,7 +8407,7 @@
               <w:rPr>
                 <w:sz w:val="17"/>
               </w:rPr>
-              <w:t>7.16</w:t>
+              <w:t>7.17</w:t>
             </w:r>
           </w:p>
         </w:tc>
@@ -8491,7 +8491,7 @@
                 <w:b/>
                 <w:sz w:val="17"/>
               </w:rPr>
-              <w:t>4.9896</w:t>
+              <w:t>4.9891</w:t>
             </w:r>
           </w:p>
         </w:tc>
@@ -8511,7 +8511,7 @@
               <w:rPr>
                 <w:sz w:val="17"/>
               </w:rPr>
-              <w:t>[4.46 – 5.52] (±0.53)</w:t>
+              <w:t>[4.45 – 5.53] (±0.54)</w:t>
             </w:r>
           </w:p>
         </w:tc>
@@ -8615,7 +8615,7 @@
                 <w:b/>
                 <w:sz w:val="17"/>
               </w:rPr>
-              <w:t>4.5502</w:t>
+              <w:t>4.5561</w:t>
             </w:r>
           </w:p>
         </w:tc>
@@ -8635,7 +8635,7 @@
               <w:rPr>
                 <w:sz w:val="17"/>
               </w:rPr>
-              <w:t>[4.02 – 5.08] (±0.53)</w:t>
+              <w:t>[4.01 – 5.10] (±0.54)</w:t>
             </w:r>
           </w:p>
         </w:tc>
@@ -8655,7 +8655,7 @@
               <w:rPr>
                 <w:sz w:val="17"/>
               </w:rPr>
-              <w:t>52.24</w:t>
+              <w:t>52.30</w:t>
             </w:r>
           </w:p>
         </w:tc>
@@ -8739,7 +8739,7 @@
                 <w:b/>
                 <w:sz w:val="17"/>
               </w:rPr>
-              <w:t>3.0474</w:t>
+              <w:t>3.0317</w:t>
             </w:r>
           </w:p>
         </w:tc>
@@ -8759,7 +8759,7 @@
               <w:rPr>
                 <w:sz w:val="17"/>
               </w:rPr>
-              <w:t>[2.52 – 3.57] (±0.53)</w:t>
+              <w:t>[2.49 – 3.58] (±0.54)</w:t>
             </w:r>
           </w:p>
         </w:tc>
@@ -8779,7 +8779,7 @@
               <w:rPr>
                 <w:sz w:val="17"/>
               </w:rPr>
-              <w:t>20.72</w:t>
+              <w:t>20.62</w:t>
             </w:r>
           </w:p>
         </w:tc>
@@ -8863,7 +8863,7 @@
                 <w:b/>
                 <w:sz w:val="17"/>
               </w:rPr>
-              <w:t>4.4330</w:t>
+              <w:t>4.4166</w:t>
             </w:r>
           </w:p>
         </w:tc>
@@ -8883,7 +8883,7 @@
               <w:rPr>
                 <w:sz w:val="17"/>
               </w:rPr>
-              <w:t>[3.91 – 4.96] (±0.53)</w:t>
+              <w:t>[3.87 – 4.96] (±0.54)</w:t>
             </w:r>
           </w:p>
         </w:tc>
@@ -8903,7 +8903,7 @@
               <w:rPr>
                 <w:sz w:val="17"/>
               </w:rPr>
-              <w:t>39.85</w:t>
+              <w:t>39.71</w:t>
             </w:r>
           </w:p>
         </w:tc>
@@ -8987,7 +8987,7 @@
                 <w:b/>
                 <w:sz w:val="17"/>
               </w:rPr>
-              <w:t>4.2469</w:t>
+              <w:t>4.2450</w:t>
             </w:r>
           </w:p>
         </w:tc>
@@ -9007,7 +9007,7 @@
               <w:rPr>
                 <w:sz w:val="17"/>
               </w:rPr>
-              <w:t>[3.72 – 4.77] (±0.53)</w:t>
+              <w:t>[3.70 – 4.79] (±0.54)</w:t>
             </w:r>
           </w:p>
         </w:tc>
@@ -9111,7 +9111,7 @@
                 <w:b/>
                 <w:sz w:val="17"/>
               </w:rPr>
-              <w:t>4.6904</w:t>
+              <w:t>4.6823</w:t>
             </w:r>
           </w:p>
         </w:tc>
@@ -9131,7 +9131,7 @@
               <w:rPr>
                 <w:sz w:val="17"/>
               </w:rPr>
-              <w:t>[4.16 – 5.22] (±0.53)</w:t>
+              <w:t>[4.14 – 5.23] (±0.54)</w:t>
             </w:r>
           </w:p>
         </w:tc>
@@ -9151,7 +9151,7 @@
               <w:rPr>
                 <w:sz w:val="17"/>
               </w:rPr>
-              <w:t>6.99</w:t>
+              <w:t>6.98</w:t>
             </w:r>
           </w:p>
         </w:tc>
@@ -9235,7 +9235,7 @@
                 <w:b/>
                 <w:sz w:val="17"/>
               </w:rPr>
-              <w:t>3.1464</w:t>
+              <w:t>3.1428</w:t>
             </w:r>
           </w:p>
         </w:tc>
@@ -9255,7 +9255,7 @@
               <w:rPr>
                 <w:sz w:val="17"/>
               </w:rPr>
-              <w:t>[2.62 – 3.67] (±0.53)</w:t>
+              <w:t>[2.60 – 3.69] (±0.54)</w:t>
             </w:r>
           </w:p>
         </w:tc>
@@ -9275,7 +9275,7 @@
               <w:rPr>
                 <w:sz w:val="17"/>
               </w:rPr>
-              <w:t>25.80</w:t>
+              <w:t>25.77</w:t>
             </w:r>
           </w:p>
         </w:tc>
@@ -9359,7 +9359,7 @@
                 <w:b/>
                 <w:sz w:val="17"/>
               </w:rPr>
-              <w:t>4.2855</w:t>
+              <w:t>4.2852</w:t>
             </w:r>
           </w:p>
         </w:tc>
@@ -9379,7 +9379,7 @@
               <w:rPr>
                 <w:sz w:val="17"/>
               </w:rPr>
-              <w:t>[3.76 – 4.81] (±0.53)</w:t>
+              <w:t>[3.74 – 4.83] (±0.54)</w:t>
             </w:r>
           </w:p>
         </w:tc>
@@ -9483,7 +9483,7 @@
                 <w:b/>
                 <w:sz w:val="17"/>
               </w:rPr>
-              <w:t>3.4108</w:t>
+              <w:t>3.4046</w:t>
             </w:r>
           </w:p>
         </w:tc>
@@ -9503,7 +9503,7 @@
               <w:rPr>
                 <w:sz w:val="17"/>
               </w:rPr>
-              <w:t>[2.23 – 4.59] (±1.18)</w:t>
+              <w:t>[2.17 – 4.64] (±1.24)</w:t>
             </w:r>
           </w:p>
         </w:tc>
@@ -9523,7 +9523,7 @@
               <w:rPr>
                 <w:sz w:val="17"/>
               </w:rPr>
-              <w:t>12.28</w:t>
+              <w:t>12.26</w:t>
             </w:r>
           </w:p>
         </w:tc>
@@ -9607,7 +9607,7 @@
                 <w:b/>
                 <w:sz w:val="17"/>
               </w:rPr>
-              <w:t>3.9061</w:t>
+              <w:t>3.8811</w:t>
             </w:r>
           </w:p>
         </w:tc>
@@ -9627,7 +9627,7 @@
               <w:rPr>
                 <w:sz w:val="17"/>
               </w:rPr>
-              <w:t>[3.22 – 4.59] (±0.69)</w:t>
+              <w:t>[3.23 – 4.53] (±0.65)</w:t>
             </w:r>
           </w:p>
         </w:tc>
@@ -9647,7 +9647,7 @@
               <w:rPr>
                 <w:sz w:val="17"/>
               </w:rPr>
-              <w:t>26.91</w:t>
+              <w:t>26.74</w:t>
             </w:r>
           </w:p>
         </w:tc>
@@ -9731,7 +9731,7 @@
                 <w:b/>
                 <w:sz w:val="17"/>
               </w:rPr>
-              <w:t>4.1934</w:t>
+              <w:t>4.1996</w:t>
             </w:r>
           </w:p>
         </w:tc>
@@ -9751,7 +9751,7 @@
               <w:rPr>
                 <w:sz w:val="17"/>
               </w:rPr>
-              <w:t>[3.61 – 4.77] (±0.58)</w:t>
+              <w:t>[3.61 – 4.79] (±0.59)</w:t>
             </w:r>
           </w:p>
         </w:tc>
@@ -9771,7 +9771,7 @@
               <w:rPr>
                 <w:sz w:val="17"/>
               </w:rPr>
-              <w:t>5.91</w:t>
+              <w:t>5.92</w:t>
             </w:r>
           </w:p>
         </w:tc>
@@ -9855,7 +9855,7 @@
                 <w:b/>
                 <w:sz w:val="17"/>
               </w:rPr>
-              <w:t>4.3259</w:t>
+              <w:t>4.3128</w:t>
             </w:r>
           </w:p>
         </w:tc>
@@ -9875,7 +9875,7 @@
               <w:rPr>
                 <w:sz w:val="17"/>
               </w:rPr>
-              <w:t>[3.80 – 4.85] (±0.53)</w:t>
+              <w:t>[3.77 – 4.86] (±0.54)</w:t>
             </w:r>
           </w:p>
         </w:tc>
@@ -9895,7 +9895,7 @@
               <w:rPr>
                 <w:sz w:val="17"/>
               </w:rPr>
-              <w:t>24.48</w:t>
+              <w:t>24.41</w:t>
             </w:r>
           </w:p>
         </w:tc>
@@ -9979,7 +9979,7 @@
                 <w:b/>
                 <w:sz w:val="17"/>
               </w:rPr>
-              <w:t>4.4646</w:t>
+              <w:t>4.4568</w:t>
             </w:r>
           </w:p>
         </w:tc>
@@ -9999,7 +9999,7 @@
               <w:rPr>
                 <w:sz w:val="17"/>
               </w:rPr>
-              <w:t>[3.94 – 4.99] (±0.53)</w:t>
+              <w:t>[3.91 – 5.00] (±0.54)</w:t>
             </w:r>
           </w:p>
         </w:tc>
@@ -10019,7 +10019,7 @@
               <w:rPr>
                 <w:sz w:val="17"/>
               </w:rPr>
-              <w:t>18.44</w:t>
+              <w:t>18.41</w:t>
             </w:r>
           </w:p>
         </w:tc>
@@ -10103,7 +10103,7 @@
                 <w:b/>
                 <w:sz w:val="17"/>
               </w:rPr>
-              <w:t>2.9515</w:t>
+              <w:t>2.9540</w:t>
             </w:r>
           </w:p>
         </w:tc>
@@ -10123,7 +10123,7 @@
               <w:rPr>
                 <w:sz w:val="17"/>
               </w:rPr>
-              <w:t>[2.42 – 3.48] (±0.53)</w:t>
+              <w:t>[2.41 – 3.50] (±0.54)</w:t>
             </w:r>
           </w:p>
         </w:tc>
@@ -10143,7 +10143,7 @@
               <w:rPr>
                 <w:sz w:val="17"/>
               </w:rPr>
-              <w:t>23.17</w:t>
+              <w:t>23.19</w:t>
             </w:r>
           </w:p>
         </w:tc>
@@ -10227,7 +10227,7 @@
                 <w:b/>
                 <w:sz w:val="17"/>
               </w:rPr>
-              <w:t>4.4194</w:t>
+              <w:t>4.4211</w:t>
             </w:r>
           </w:p>
         </w:tc>
@@ -10247,7 +10247,7 @@
               <w:rPr>
                 <w:sz w:val="17"/>
               </w:rPr>
-              <w:t>[3.89 – 4.95] (±0.53)</w:t>
+              <w:t>[3.88 – 4.96] (±0.54)</w:t>
             </w:r>
           </w:p>
         </w:tc>
@@ -10267,7 +10267,7 @@
               <w:rPr>
                 <w:sz w:val="17"/>
               </w:rPr>
-              <w:t>51.71</w:t>
+              <w:t>51.73</w:t>
             </w:r>
           </w:p>
         </w:tc>
@@ -10351,7 +10351,7 @@
                 <w:b/>
                 <w:sz w:val="17"/>
               </w:rPr>
-              <w:t>4.5705</w:t>
+              <w:t>4.5730</w:t>
             </w:r>
           </w:p>
         </w:tc>
@@ -10371,7 +10371,7 @@
               <w:rPr>
                 <w:sz w:val="17"/>
               </w:rPr>
-              <w:t>[4.04 – 5.10] (±0.53)</w:t>
+              <w:t>[4.03 – 5.12] (±0.54)</w:t>
             </w:r>
           </w:p>
         </w:tc>
@@ -10391,7 +10391,7 @@
               <w:rPr>
                 <w:sz w:val="17"/>
               </w:rPr>
-              <w:t>10.69</w:t>
+              <w:t>10.70</w:t>
             </w:r>
           </w:p>
         </w:tc>
@@ -10475,7 +10475,7 @@
                 <w:b/>
                 <w:sz w:val="17"/>
               </w:rPr>
-              <w:t>4.3415</w:t>
+              <w:t>4.3427</w:t>
             </w:r>
           </w:p>
         </w:tc>
@@ -10495,7 +10495,7 @@
               <w:rPr>
                 <w:sz w:val="17"/>
               </w:rPr>
-              <w:t>[3.81 – 4.87] (±0.53)</w:t>
+              <w:t>[3.80 – 4.89] (±0.54)</w:t>
             </w:r>
           </w:p>
         </w:tc>
@@ -10515,7 +10515,7 @@
               <w:rPr>
                 <w:sz w:val="17"/>
               </w:rPr>
-              <w:t>21.75</w:t>
+              <w:t>21.76</w:t>
             </w:r>
           </w:p>
         </w:tc>
@@ -10599,7 +10599,7 @@
                 <w:b/>
                 <w:sz w:val="17"/>
               </w:rPr>
-              <w:t>4.9349</w:t>
+              <w:t>4.9337</w:t>
             </w:r>
           </w:p>
         </w:tc>
@@ -10619,7 +10619,7 @@
               <w:rPr>
                 <w:sz w:val="17"/>
               </w:rPr>
-              <w:t>[4.41 – 5.46] (±0.53)</w:t>
+              <w:t>[4.39 – 5.48] (±0.54)</w:t>
             </w:r>
           </w:p>
         </w:tc>
@@ -10639,7 +10639,7 @@
               <w:rPr>
                 <w:sz w:val="17"/>
               </w:rPr>
-              <w:t>8.64</w:t>
+              <w:t>8.63</w:t>
             </w:r>
           </w:p>
         </w:tc>
@@ -10723,7 +10723,7 @@
                 <w:b/>
                 <w:sz w:val="17"/>
               </w:rPr>
-              <w:t>5.0007</w:t>
+              <w:t>4.9813</w:t>
             </w:r>
           </w:p>
         </w:tc>
@@ -10743,7 +10743,7 @@
               <w:rPr>
                 <w:sz w:val="17"/>
               </w:rPr>
-              <w:t>[4.47 – 5.53] (±0.53)</w:t>
+              <w:t>[4.44 – 5.53] (±0.54)</w:t>
             </w:r>
           </w:p>
         </w:tc>
@@ -10763,7 +10763,7 @@
               <w:rPr>
                 <w:sz w:val="17"/>
               </w:rPr>
-              <w:t>10.70</w:t>
+              <w:t>10.66</w:t>
             </w:r>
           </w:p>
         </w:tc>

</xml_diff>

<commit_message>
docs: align deliverables with challenge rules
Co-authored-by: Copilot <223556219+Copilot@users.noreply.github.com>
</commit_message>
<xml_diff>
--- a/Documento_Tecnico_Agrotec_Amanteca_FIRA2026.docx
+++ b/Documento_Tecnico_Agrotec_Amanteca_FIRA2026.docx
@@ -486,7 +486,7 @@
                 <w:b/>
                 <w:sz w:val="17"/>
               </w:rPr>
-              <w:t>Paridad Exacta CV == Modelo Final</w:t>
+              <w:t>Paridad Verificada CV == Modelo Final</w:t>
             </w:r>
           </w:p>
         </w:tc>
@@ -727,6 +727,288 @@
         </w:tc>
       </w:tr>
     </w:tbl>
+    <w:p>
+      <w:r>
+        <w:br w:type="page"/>
+      </w:r>
+    </w:p>
+    <w:p>
+      <w:pPr>
+        <w:pStyle w:val="Heading1"/>
+      </w:pPr>
+      <w:r>
+        <w:rPr>
+          <w:rFonts w:ascii="Calibri" w:hAnsi="Calibri"/>
+          <w:b/>
+          <w:color w:val="111111"/>
+          <w:sz w:val="29"/>
+        </w:rPr>
+        <w:t>A. Introducción</w:t>
+      </w:r>
+    </w:p>
+    <w:p>
+      <w:r>
+        <w:t>El Reto AgroCebada FIRA 2026 solicita una solución analítica capaz de estimar el rendimiento de parcelas de cebada en Hidalgo, Tlaxcala y Puebla y convertirlo en una herramienta funcional de consulta. Agrotec-Amanteca responde a ese objetivo mediante un sistema que integra información satelital, climática, topográfica y geoespacial para producir una estimación por parcela. El problema es relevante porque el rendimiento agrícola depende de condiciones que cambian entre localidades y ciclos, mientras que las decisiones productivas y financieras requieren información espacialmente detallada y disponible antes de la cosecha. El dataset oficial contiene 197 parcelas georreferenciadas: 138 con rendimiento observado, utilizadas para entrenar y validar, y 59 cuyo rendimiento fue reservado para evaluación. Por tanto, el proyecto no intenta reemplazar la medición de campo; construye una estimación reproducible para apoyar la priorización de parcelas, la interpretación de escenarios y la comunicación de riesgo. La solución combina un pipeline de ingeniería de datos con un ensamble de Extra Trees, Random Forest, SVR y Gradient Boosting. Antes del entrenamiento se calculan índices agronómicos derivados de las series mensuales de NDVI/EVI, precipitación, temperatura, elevación, pendiente y superficie. La selección de variables se realiza dentro de los pliegues de validación para evitar que las etiquetas de validación influyan en el entrenamiento. El componente espacial IDW se calcula en coordenadas métricas UTM 14N y utiliza únicamente referencias permitidas en cada fold. El resultado se publica como artefactos auditables, API FastAPI y dashboard web responsive disponible en GitHub Pages. La aplicación permite consultar el mapa, revisar predicciones, explorar incertidumbre y ejecutar escenarios de vigor satelital, precipitación y temperatura. La contribución principal es un flujo de extremo a extremo que conecta datos con una interfaz usable, manteniendo una interpretación honesta: las métricas son predictivas y observacionales, no una prueba de causalidad agronómica.</w:t>
+      </w:r>
+    </w:p>
+    <w:p>
+      <w:pPr>
+        <w:pStyle w:val="Heading1"/>
+      </w:pPr>
+      <w:r>
+        <w:rPr>
+          <w:rFonts w:ascii="Calibri" w:hAnsi="Calibri"/>
+          <w:b/>
+          <w:color w:val="111111"/>
+          <w:sz w:val="29"/>
+        </w:rPr>
+        <w:t>B. Justificación</w:t>
+      </w:r>
+    </w:p>
+    <w:p>
+      <w:r>
+        <w:t>Una predicción por parcela puede complementar la información de campo al identificar diferencias espaciales y comunicar el nivel de incertidumbre asociado. El proyecto se justifica porque combina variables que representan vigor vegetal, disponibilidad hídrica, régimen térmico y contexto físico con una aplicación consultable por personas no especialistas. La selección y validación controladas reducen el riesgo de sobreajuste, mientras que la comparación contra un estimador nulo y un baseline permite medir si la complejidad añadida aporta valor real. La herramienta se plantea como apoyo a la decisión, no como sustituto de la experiencia del productor ni como garantía de rendimiento.</w:t>
+      </w:r>
+    </w:p>
+    <w:p>
+      <w:pPr>
+        <w:pStyle w:val="Heading1"/>
+      </w:pPr>
+      <w:r>
+        <w:rPr>
+          <w:rFonts w:ascii="Calibri" w:hAnsi="Calibri"/>
+          <w:b/>
+          <w:color w:val="111111"/>
+          <w:sz w:val="29"/>
+        </w:rPr>
+        <w:t>C. Objetivos</w:t>
+      </w:r>
+    </w:p>
+    <w:p>
+      <w:r>
+        <w:t>Objetivo general: desarrollar y documentar un modelo analítico y una aplicación web funcional para estimar el rendimiento de cebada por parcela en el conjunto oficial del Reto AgroCebada FIRA 2026. Objetivos específicos: integrar las variables oficiales y su referencia geoespacial; construir índices agronómicos deterministas; seleccionar predictores reduciendo redundancia y evitando fuga de información; comparar un ensamble con un baseline Random Forest y un DummyRegressor; cuantificar error mediante MAE, RMSE y R² con validación cruzada de cinco pliegues y repetición 5×5; calibrar una banda de incertidumbre con cobertura empírica fuera de muestra; exportar predicciones para las 59 parcelas ciegas; ofrecer consulta cartográfica, simulación de escenarios y descarga de resultados; y explicar las limitaciones para que la herramienta se use responsablemente en contextos agrícolas y financieros.</w:t>
+      </w:r>
+    </w:p>
+    <w:p>
+      <w:pPr>
+        <w:pStyle w:val="Heading1"/>
+      </w:pPr>
+      <w:r>
+        <w:rPr>
+          <w:rFonts w:ascii="Calibri" w:hAnsi="Calibri"/>
+          <w:b/>
+          <w:color w:val="111111"/>
+          <w:sz w:val="29"/>
+        </w:rPr>
+        <w:t>D. Metodología</w:t>
+      </w:r>
+    </w:p>
+    <w:p>
+      <w:r>
+        <w:t>El universo se compone de 197 polígonos georreferenciados, con 138 etiquetas de rendimiento disponibles y 59 reservadas para predicción. Los polígonos se visualizan en WGS84 y sus centroides se calculan temporalmente en UTM Zona 14N (EPSG:32614), evitando medir distancias en grados. Las variables ambientales incluyen índices NDVI/EVI, precipitación CHIRPS, temperaturas máxima y mínima, elevación, pendiente y superficie. La extracción zonal documentada utiliza all_touched=True para no descartar parcelas pequeñas. A partir de las columnas originales se calculan cinco índices: área bajo la curva de NDVI, tasa vegetativa, caída de madurez, índice hidrotérmico y retención topográfica. El transformador LeakFreeSmartPearsonIDW ordena variables por correlación absoluta con el objetivo únicamente dentro del entrenamiento de cada fold, elimina redundancia con umbral 0.88 y conserva 22 variables; después agrega spatial_idw_yield. El IDW usa las siete referencias más cercanas, potencia 1.5 y solo rendimientos del fold de entrenamiento, excluyendo coincidencias exactas. El modelo final es un VotingRegressor con Extra Trees 40%, Random Forest 25%, SVR 20% y Gradient Boosting 15%. Se comparan 11 configuraciones con KFold de cinco pliegues y RepeatedKFold 5×5, usando MAE, RMSE y R². Las predicciones OOF se calculan para que cada parcela sea evaluada por un modelo que no vio su etiqueta. La incertidumbre se calibra usando residuos OOF y una escala de dispersión del ensamble; la cobertura reportada es empírica. Finalmente, se ajusta el modelo con las etiquetas disponibles, se serializa en joblib y se sincronizan JSON, CSV, GeoJSON, dashboard y documento Word. El simulador modifica entradas, recalcula índices y evalúa escenarios combinados directamente con el modelo.</w:t>
+      </w:r>
+    </w:p>
+    <w:p>
+      <w:pPr>
+        <w:pStyle w:val="Heading1"/>
+      </w:pPr>
+      <w:r>
+        <w:rPr>
+          <w:rFonts w:ascii="Calibri" w:hAnsi="Calibri"/>
+          <w:b/>
+          <w:color w:val="111111"/>
+          <w:sz w:val="29"/>
+        </w:rPr>
+        <w:t>E. Resultados y discusión</w:t>
+      </w:r>
+    </w:p>
+    <w:p>
+      <w:r>
+        <w:t>El ensamble seleccionado obtuvo MAE 5-Fold de 0.3562 ± 0.0662 t/ha, RMSE de 0.4968 ± 0.1084 t/ha, RMSE 5×5 de 0.5073 ± 0.1183 t/ha y R² de 0.6124 ± 0.1804. El baseline Random Forest con 39 variables obtuvo MAE 0.3742 y RMSE 0.5139 t/ha, mientras que el DummyRegressor obtuvo MAE 0.7585 y RMSE 0.8545 t/ha. La comparación demuestra una mejora medida frente a ambos referentes, aunque la diferencia frente al baseline es moderada y debe interpretarse junto con las desviaciones estándar. El 72.5% de las predicciones OOF tuvo error absoluto menor o igual a 0.50 t/ha. La banda nominal de 80% alcanzó 81.2% de cobertura empírica OOF con semiancho medio de 0.584 t/ha. Estos resultados respaldan una herramienta predictiva inicial, pero no garantizan el mismo desempeño en otra región, año o distribución de clima. El modelo usa 23 predictores y los artefactos comprueban la paridad entre selección, entrenamiento e inferencia. El simulador responde de forma conjunta y no suma efectos marginales, respetando la posible no linealidad del ensamble. El dashboard permite observar la distribución espacial y consultar las 59 predicciones ciegas con intervalos. La principal limitación es el tamaño muestral: 138 etiquetas son suficientes para una primera solución tabular, pero generan variabilidad entre particiones. La siguiente validación recomendada es temporal y espacial, con datos de una campaña o localidad no utilizada para ajustar decisiones. También se recomienda monitorear fuera de dominio y separar calibración conformal de evaluación externa cuando existan más observaciones.</w:t>
+      </w:r>
+    </w:p>
+    <w:p>
+      <w:pPr>
+        <w:pStyle w:val="Heading1"/>
+      </w:pPr>
+      <w:r>
+        <w:rPr>
+          <w:rFonts w:ascii="Calibri" w:hAnsi="Calibri"/>
+          <w:b/>
+          <w:color w:val="111111"/>
+          <w:sz w:val="29"/>
+        </w:rPr>
+        <w:t>F. Uso de la ciencia de datos en la inclusión financiera del sector agro</w:t>
+      </w:r>
+    </w:p>
+    <w:p>
+      <w:r>
+        <w:t>La inclusión financiera requiere que productores y organizaciones puedan presentar información comprensible para planear inversiones, seguros, crédito y asistencia técnica. Un rendimiento estimado por parcela no constituye por sí mismo una autorización de crédito ni sustituye la evaluación financiera; sin embargo, puede servir como insumo operativo para ordenar visitas, comparar escenarios y discutir riesgos productivos con mayor evidencia. El dashboard traduce variables técnicas a una consulta visual y exportable: cada parcela tiene una estimación, producción calculada según su superficie e intervalo de incertidumbre. Esto puede ayudar a que instituciones y técnicos identifiquen dónde hace falta información adicional antes de tomar una decisión, evitando tratar una predicción puntual como certeza. El simulador permite explorar escenarios de clima y vigor, siempre con la advertencia de que son sensibilidades observacionales y no efectos causales. En una etapa posterior, el sistema podría integrarse con registros de manejo, costos, ingresos y siniestralidad para construir indicadores financieros más completos, con consentimiento y protección de datos. La aplicación de ciencia de datos es responsable cuando hace explícitos sus supuestos, mide su error, señala incertidumbre y permite auditoría. Por ello, la propuesta contribuye a la inclusión financiera como herramienta de información y priorización, no como mecanismo automático de aprobación o rechazo de productores.</w:t>
+      </w:r>
+    </w:p>
+    <w:p>
+      <w:pPr>
+        <w:pStyle w:val="Heading1"/>
+      </w:pPr>
+      <w:r>
+        <w:rPr>
+          <w:rFonts w:ascii="Calibri" w:hAnsi="Calibri"/>
+          <w:b/>
+          <w:color w:val="111111"/>
+          <w:sz w:val="29"/>
+        </w:rPr>
+        <w:t>G. Conclusiones</w:t>
+      </w:r>
+    </w:p>
+    <w:p>
+      <w:r>
+        <w:t>Agrotec-Amanteca cumplió el objetivo de construir una solución funcional para estimar el rendimiento de cebada por parcela y consultar sus resultados en una interfaz web. La integración de datos satelitales, climáticos, topográficos y espaciales produjo un conjunto de 23 predictores consistente entre validación e inferencia. El ensamble superó al baseline y a la referencia nula bajo métricas medidas, y la validación OOF permitió reportar tanto error como cobertura empírica de incertidumbre. La aplicación aporta valor porque conecta el resultado estadístico con un mapa, una tabla exportable y un simulador trazable. La conclusión no es que el modelo sea universal ni causal: su confiabilidad está condicionada por las 138 parcelas etiquetadas, la representatividad del dataset y la similitud entre futuras observaciones y el dominio de entrenamiento. Para fortalecerlo se requieren nuevas parcelas independientes, campañas agrícolas adicionales y validaciones por localidad y tiempo. También debe mantenerse la separación entre predicción, simulación y decisión financiera. Bajo esas condiciones, el sistema es una base estable, lógica y auditable para apoyo a decisiones agrícolas, y cuenta con una ruta clara de mejora sin depender de añadir complejidad innecesaria.</w:t>
+      </w:r>
+    </w:p>
+    <w:p>
+      <w:pPr>
+        <w:pStyle w:val="Heading1"/>
+      </w:pPr>
+      <w:r>
+        <w:rPr>
+          <w:rFonts w:ascii="Calibri" w:hAnsi="Calibri"/>
+          <w:b/>
+          <w:color w:val="111111"/>
+          <w:sz w:val="29"/>
+        </w:rPr>
+        <w:t>H. Bibliografía</w:t>
+      </w:r>
+    </w:p>
+    <w:p>
+      <w:pPr>
+        <w:pStyle w:val="ListBullet"/>
+      </w:pPr>
+      <w:r>
+        <w:t>FIRA. (2026). Bases de participación: Reto AgroCebada FIRA 2026. Documento oficial proporcionado por el comité organizador.</w:t>
+      </w:r>
+    </w:p>
+    <w:p>
+      <w:pPr>
+        <w:pStyle w:val="ListBullet"/>
+      </w:pPr>
+      <w:r>
+        <w:t>FIRA. (2025). Reglas de Operación para apoyos a los sectores agropecuario, forestal, pesquero, alimentario y rural. Diario Oficial de la Federación.</w:t>
+      </w:r>
+    </w:p>
+    <w:p>
+      <w:pPr>
+        <w:pStyle w:val="ListBullet"/>
+      </w:pPr>
+      <w:r>
+        <w:t>Breiman, L. (2001). Random Forests. Machine Learning, 45, 5–32.</w:t>
+      </w:r>
+    </w:p>
+    <w:p>
+      <w:pPr>
+        <w:pStyle w:val="ListBullet"/>
+      </w:pPr>
+      <w:r>
+        <w:t>Geodetic Survey / EPSG.io. (s. f.). EPSG:4326 WGS 84 y EPSG:32614 WGS 84 / UTM zone 14N.</w:t>
+      </w:r>
+    </w:p>
+    <w:p>
+      <w:pPr>
+        <w:pStyle w:val="ListBullet"/>
+      </w:pPr>
+      <w:r>
+        <w:t>Scikit-learn developers. (s. f.). Scikit-learn User Guide: model selection, ensembles, pipelines and metrics. https://scikit-learn.org/</w:t>
+      </w:r>
+    </w:p>
+    <w:p>
+      <w:pPr>
+        <w:pStyle w:val="ListBullet"/>
+      </w:pPr>
+      <w:r>
+        <w:t>FastAPI developers. (s. f.). FastAPI documentation. https://fastapi.tiangolo.com/</w:t>
+      </w:r>
+    </w:p>
+    <w:p>
+      <w:pPr>
+        <w:pStyle w:val="ListBullet"/>
+      </w:pPr>
+      <w:r>
+        <w:t>CHIRPS Climate Hazards Center. (s. f.). Climate Hazards InfraRed Precipitation with Station data.</w:t>
+      </w:r>
+    </w:p>
+    <w:p>
+      <w:pPr>
+        <w:pStyle w:val="Heading1"/>
+      </w:pPr>
+      <w:r>
+        <w:rPr>
+          <w:rFonts w:ascii="Calibri" w:hAnsi="Calibri"/>
+          <w:b/>
+          <w:color w:val="111111"/>
+          <w:sz w:val="29"/>
+        </w:rPr>
+        <w:t>I. Anexos y cumplimiento de entregables</w:t>
+      </w:r>
+    </w:p>
+    <w:p>
+      <w:r>
+        <w:t>Anexo 1 — Aportaciones individuales: este apartado debe completarse con las actividades reales de cada integrante antes de subir el documento a la plataforma. No se asignan cargos ficticios.</w:t>
+      </w:r>
+    </w:p>
+    <w:p>
+      <w:pPr>
+        <w:pStyle w:val="ListBullet"/>
+      </w:pPr>
+      <w:r>
+        <w:t>Gael Askary Razo Montañez: [COMPLETAR POR EL EQUIPO: actividades y aportaciones verificables]</w:t>
+      </w:r>
+    </w:p>
+    <w:p>
+      <w:pPr>
+        <w:pStyle w:val="ListBullet"/>
+      </w:pPr>
+      <w:r>
+        <w:t>Limhi Gerson López Momox: [COMPLETAR POR EL EQUIPO: actividades y aportaciones verificables]</w:t>
+      </w:r>
+    </w:p>
+    <w:p>
+      <w:pPr>
+        <w:pStyle w:val="ListBullet"/>
+      </w:pPr>
+      <w:r>
+        <w:t>Karla Yaneth Cruz Sandoval: [COMPLETAR POR EL EQUIPO: actividades y aportaciones verificables]</w:t>
+      </w:r>
+    </w:p>
+    <w:p>
+      <w:pPr>
+        <w:pStyle w:val="ListBullet"/>
+      </w:pPr>
+      <w:r>
+        <w:t>Arturo Huerta Maldonado: [COMPLETAR POR EL EQUIPO: actividades y aportaciones verificables]</w:t>
+      </w:r>
+    </w:p>
+    <w:p>
+      <w:pPr>
+        <w:pStyle w:val="ListBullet"/>
+      </w:pPr>
+      <w:r>
+        <w:t>Juan Enrique Gutierrez Hernández: [COMPLETAR POR EL EQUIPO: actividades y aportaciones verificables]</w:t>
+      </w:r>
+    </w:p>
+    <w:p>
+      <w:r>
+        <w:t>Anexo 2 — Uso de Inteligencia Artificial: las bases permiten IA si se indica dónde fue utilizada y se anexan los prompts. Completar antes de la entrega con herramientas, componentes afectados y prompts realmente usados.</w:t>
+      </w:r>
+    </w:p>
+    <w:p>
+      <w:r>
+        <w:t>Herramientas de IA: [COMPLETAR]. Ubicación de uso: [COMPLETAR]. Prompts declarados: [COMPLETAR O INDICAR QUE NO SE UTILIZARON]. El equipo conserva responsabilidad sobre la revisión, ejecución y autoría del código.</w:t>
+      </w:r>
+    </w:p>
+    <w:p>
+      <w:r>
+        <w:t>Anexo 3 — Prototipo y video: dashboard funcional: https://galektato.github.io/Agrotec-Amanteca/. Código fuente: https://github.com/GalekTato/Agrotec-Amanteca. Video demostrativo de máximo cinco minutos: [PENDIENTE DE SUBIR A LA PLATAFORMA O COMPLETAR CON EL ENLACE DEFINITIVO].</w:t>
+      </w:r>
+    </w:p>
     <w:p>
       <w:r>
         <w:br w:type="page"/>
@@ -801,7 +1083,7 @@
         <w:rPr>
           <w:b/>
         </w:rPr>
-        <w:t xml:space="preserve">Etapa 4 — Selección Leak-Free Smart-Pearson (|r| &lt; 0.88) y Paridad Exacta con el Modelo Publicado: </w:t>
+        <w:t xml:space="preserve">Etapa 4 — Selección Leak-Free Smart-Pearson (|r| &lt; 0.88) y Paridad Verificada con el Modelo Publicado: </w:t>
       </w:r>
       <w:r>
         <w:t>Al auditar la matriz inicial de 175 columnas frente al filtro de Pearson secuencial tradicional (39 variables), se identificó que recorrer las columnas en orden posicional descartaba variables con mayor correlación con el rendimiento como tmin_2025_10 y evi_promedio_mes_5. El transformador LeakFreeSmartPearsonIDW ordena los candidatos por |r(X_i, y)| exclusivamente dentro de cada pliegue de entrenamiento y poda pares colineales con |r(X_i, X_j)| &gt;= 0.88 (correlación máxima resultante entre predictores = 0.8646, media = 0.3999), seleccionando exactamente 22 variables base.</w:t>
@@ -3211,7 +3493,7 @@
               <w:rPr>
                 <w:sz w:val="18"/>
               </w:rPr>
-              <w:t>Servicio RESTful con 0 DeprecationWarnings, superficie de sensibilidad precalculada del modelo real (sensibilidad_simulador.json) y suite de pruebas automatizadas.</w:t>
+              <w:t>Servicio RESTful con sin advertencias deprecatorias, superficie de sensibilidad precalculada del modelo real (sensibilidad_simulador.json) y suite de pruebas automatizadas.</w:t>
             </w:r>
           </w:p>
         </w:tc>

</xml_diff>

<commit_message>
docs: declare AI use and team roles
Co-authored-by: Copilot <223556219+Copilot@users.noreply.github.com>
</commit_message>
<xml_diff>
--- a/Documento_Tecnico_Agrotec_Amanteca_FIRA2026.docx
+++ b/Documento_Tecnico_Agrotec_Amanteca_FIRA2026.docx
@@ -951,7 +951,7 @@
     </w:p>
     <w:p>
       <w:r>
-        <w:t>Anexo 1 — Aportaciones individuales: este apartado debe completarse con las actividades reales de cada integrante antes de subir el documento a la plataforma. No se asignan cargos ficticios.</w:t>
+        <w:t>Anexo 1 — Integración y aportaciones del equipo: se documentan las funciones declaradas por el equipo. Las responsabilidades fueron colaborativas y todos los integrantes participaron en la revisión final.</w:t>
       </w:r>
     </w:p>
     <w:p>
@@ -959,7 +959,7 @@
         <w:pStyle w:val="ListBullet"/>
       </w:pPr>
       <w:r>
-        <w:t>Gael Askary Razo Montañez: [COMPLETAR POR EL EQUIPO: actividades y aportaciones verificables]</w:t>
+        <w:t>Gael Askary Razo Montañez — PM y apoyo general</w:t>
       </w:r>
     </w:p>
     <w:p>
@@ -967,7 +967,7 @@
         <w:pStyle w:val="ListBullet"/>
       </w:pPr>
       <w:r>
-        <w:t>Limhi Gerson López Momox: [COMPLETAR POR EL EQUIPO: actividades y aportaciones verificables]</w:t>
+        <w:t>Limhi Gerson López Momox — Ingeniero de datos</w:t>
       </w:r>
     </w:p>
     <w:p>
@@ -975,7 +975,7 @@
         <w:pStyle w:val="ListBullet"/>
       </w:pPr>
       <w:r>
-        <w:t>Karla Yaneth Cruz Sandoval: [COMPLETAR POR EL EQUIPO: actividades y aportaciones verificables]</w:t>
+        <w:t>Karla Yaneth Cruz Sandoval — Desarrolladora frontend</w:t>
       </w:r>
     </w:p>
     <w:p>
@@ -983,7 +983,7 @@
         <w:pStyle w:val="ListBullet"/>
       </w:pPr>
       <w:r>
-        <w:t>Arturo Huerta Maldonado: [COMPLETAR POR EL EQUIPO: actividades y aportaciones verificables]</w:t>
+        <w:t>Arturo Huerta Maldonado — Desarrollador backend</w:t>
       </w:r>
     </w:p>
     <w:p>
@@ -991,17 +991,94 @@
         <w:pStyle w:val="ListBullet"/>
       </w:pPr>
       <w:r>
-        <w:t>Juan Enrique Gutierrez Hernández: [COMPLETAR POR EL EQUIPO: actividades y aportaciones verificables]</w:t>
+        <w:t>Juan Enrique Gutierrez Hernández — Científico de datos</w:t>
       </w:r>
     </w:p>
     <w:p>
       <w:r>
-        <w:t>Anexo 2 — Uso de Inteligencia Artificial: las bases permiten IA si se indica dónde fue utilizada y se anexan los prompts. Completar antes de la entrega con herramientas, componentes afectados y prompts realmente usados.</w:t>
+        <w:t>Anexo 2 — Declaración de uso de Inteligencia Artificial: las bases permiten IA si se indica dónde fue utilizada y se anexan los prompts. La IA se empleó como asistencia técnica, no como sustituto de la decisión, ejecución ni validación del equipo.</w:t>
       </w:r>
     </w:p>
     <w:p>
       <w:r>
-        <w:t>Herramientas de IA: [COMPLETAR]. Ubicación de uso: [COMPLETAR]. Prompts declarados: [COMPLETAR O INDICAR QUE NO SE UTILIZARON]. El equipo conserva responsabilidad sobre la revisión, ejecución y autoría del código.</w:t>
+        <w:t>Herramientas utilizadas: GitHub Copilot CLI para auditoría, programación asistida, pruebas y documentación; Antigravity CLI exclusivamente como apoyo para correcciones y ajustes del diseño frontend. El equipo conserva la responsabilidad completa sobre la autoría, revisión, ejecución, interpretación y entrega.</w:t>
+      </w:r>
+    </w:p>
+    <w:p>
+      <w:pPr>
+        <w:pStyle w:val="ListBullet"/>
+      </w:pPr>
+      <w:r>
+        <w:t>Prompts representativos utilizados durante el desarrollo:</w:t>
+      </w:r>
+    </w:p>
+    <w:p>
+      <w:pPr>
+        <w:pStyle w:val="ListBullet2"/>
+      </w:pPr>
+      <w:r>
+        <w:t>IA-01 — Audita exhaustivamente el pipeline de Machine Learning e identifica riesgos de data leakage, especialmente en la selección de variables y el cálculo IDW dentro de la validación cruzada.</w:t>
+      </w:r>
+    </w:p>
+    <w:p>
+      <w:pPr>
+        <w:pStyle w:val="ListBullet2"/>
+      </w:pPr>
+      <w:r>
+        <w:t>IA-02 — Comprueba si existe paridad entre las variables usadas en Cross-Validation, el modelo serializado y la inferencia de producción.</w:t>
+      </w:r>
+    </w:p>
+    <w:p>
+      <w:pPr>
+        <w:pStyle w:val="ListBullet2"/>
+      </w:pPr>
+      <w:r>
+        <w:t>IA-03 — Revisa si el simulador evalúa escenarios combinados directamente con el modelo o si suma efectos marginales de forma incorrecta.</w:t>
+      </w:r>
+    </w:p>
+    <w:p>
+      <w:pPr>
+        <w:pStyle w:val="ListBullet2"/>
+      </w:pPr>
+      <w:r>
+        <w:t>IA-04 — Revisa la API FastAPI, sus validaciones, sus advertencias deprecatorias y la cobertura de las pruebas automatizadas.</w:t>
+      </w:r>
+    </w:p>
+    <w:p>
+      <w:pPr>
+        <w:pStyle w:val="ListBullet2"/>
+      </w:pPr>
+      <w:r>
+        <w:t>IA-05 — Revisa que el simulador y la curva fenológica reaccionen coherentemente a NDVI, precipitación y temperatura.</w:t>
+      </w:r>
+    </w:p>
+    <w:p>
+      <w:pPr>
+        <w:pStyle w:val="ListBullet2"/>
+      </w:pPr>
+      <w:r>
+        <w:t>IA-06 — Compara las métricas del dashboard, README, artefactos y documento técnico para detectar números o afirmaciones inconsistentes.</w:t>
+      </w:r>
+    </w:p>
+    <w:p>
+      <w:pPr>
+        <w:pStyle w:val="ListBullet2"/>
+      </w:pPr>
+      <w:r>
+        <w:t>IA-07 — Compara el reporte técnico del proyecto contra las bases oficiales del Reto AgroCebada FIRA 2026 e identifica entregables faltantes.</w:t>
+      </w:r>
+    </w:p>
+    <w:p>
+      <w:pPr>
+        <w:pStyle w:val="ListBullet2"/>
+      </w:pPr>
+      <w:r>
+        <w:t>IA-08 — Prepara una guía de defensa oral con preguntas difíciles sobre fuga de datos, tamaño de muestra, causalidad, conformal e incertidumbre.</w:t>
+      </w:r>
+    </w:p>
+    <w:p>
+      <w:r>
+        <w:t>Los prompts anteriores son representativos de las instrucciones utilizadas durante el proceso; algunas consultas fueron iterativas. Las recomendaciones fueron revisadas por el equipo, y los cambios incorporados se ejecutaron y verificaron mediante pruebas, compilación o inspección directa de los artefactos. Las métricas reportadas fueron generadas por la ejecución del pipeline y no fueron inventadas por una herramienta de IA.</w:t>
       </w:r>
     </w:p>
     <w:p>

</xml_diff>